<commit_message>
LAS 20 PLANTILLAS CORREGIDAS CON VARIABLES.
</commit_message>
<xml_diff>
--- a/backend/templates/CDMX_AP_H_CASADO.docx
+++ b/backend/templates/CDMX_AP_H_CASADO.docx
@@ -271,8 +271,8 @@
         </w:rPr>
         <w:t>--</w:t>
       </w:r>
-      <w:bookmarkStart w:id="0" w:name="_Hlk25759886"/>
-      <w:bookmarkStart w:id="1" w:name="_Hlk30500945"/>
+      <w:bookmarkStart w:id="0" w:name="_Hlk30500945"/>
+      <w:bookmarkStart w:id="1" w:name="_Hlk25759886"/>
       <w:r>
         <w:rPr>
           <w:rFonts w:ascii="Arial" w:hAnsi="Arial" w:cs="Arial"/>
@@ -336,62 +336,62 @@
         </w:rPr>
         <w:t>/</w:t>
       </w:r>
+      <w:bookmarkEnd w:id="0"/>
+      <w:r>
+        <w:rPr>
+          <w:rFonts w:ascii="Arial" w:hAnsi="Arial" w:cs="Arial"/>
+          <w:sz w:val="14"/>
+          <w:szCs w:val="14"/>
+          <w:lang w:val="pt-PT"/>
+        </w:rPr>
+        <w:t>JCOR</w:t>
+      </w:r>
+      <w:r>
+        <w:rPr>
+          <w:rFonts w:ascii="Arial" w:hAnsi="Arial" w:cs="Arial"/>
+          <w:sz w:val="14"/>
+          <w:szCs w:val="14"/>
+          <w:lang w:val="pt-PT"/>
+        </w:rPr>
+        <w:t>/</w:t>
+      </w:r>
+      <w:r>
+        <w:rPr>
+          <w:rFonts w:ascii="Arial" w:hAnsi="Arial" w:cs="Arial"/>
+          <w:sz w:val="14"/>
+          <w:szCs w:val="14"/>
+          <w:lang w:val="pt-PT"/>
+        </w:rPr>
+        <w:t xml:space="preserve">    </w:t>
+      </w:r>
+      <w:r>
+        <w:rPr>
+          <w:rFonts w:ascii="Arial" w:hAnsi="Arial" w:cs="Arial"/>
+          <w:sz w:val="14"/>
+          <w:szCs w:val="14"/>
+          <w:lang w:val="pt-PT"/>
+        </w:rPr>
+        <w:t>/</w:t>
+      </w:r>
+      <w:r>
+        <w:rPr>
+          <w:rFonts w:ascii="Arial" w:hAnsi="Arial" w:cs="Arial"/>
+          <w:sz w:val="14"/>
+          <w:szCs w:val="14"/>
+          <w:lang w:val="pt-PT"/>
+        </w:rPr>
+        <w:t xml:space="preserve">    </w:t>
+      </w:r>
+      <w:r>
+        <w:rPr>
+          <w:rFonts w:ascii="Arial" w:hAnsi="Arial" w:cs="Arial"/>
+          <w:sz w:val="14"/>
+          <w:szCs w:val="14"/>
+          <w:lang w:val="pt-PT"/>
+        </w:rPr>
+        <w:t xml:space="preserve">/    </w:t>
+      </w:r>
       <w:bookmarkEnd w:id="1"/>
-      <w:r>
-        <w:rPr>
-          <w:rFonts w:ascii="Arial" w:hAnsi="Arial" w:cs="Arial"/>
-          <w:sz w:val="14"/>
-          <w:szCs w:val="14"/>
-          <w:lang w:val="pt-PT"/>
-        </w:rPr>
-        <w:t>JCOR</w:t>
-      </w:r>
-      <w:r>
-        <w:rPr>
-          <w:rFonts w:ascii="Arial" w:hAnsi="Arial" w:cs="Arial"/>
-          <w:sz w:val="14"/>
-          <w:szCs w:val="14"/>
-          <w:lang w:val="pt-PT"/>
-        </w:rPr>
-        <w:t>/</w:t>
-      </w:r>
-      <w:r>
-        <w:rPr>
-          <w:rFonts w:ascii="Arial" w:hAnsi="Arial" w:cs="Arial"/>
-          <w:sz w:val="14"/>
-          <w:szCs w:val="14"/>
-          <w:lang w:val="pt-PT"/>
-        </w:rPr>
-        <w:t xml:space="preserve">    </w:t>
-      </w:r>
-      <w:r>
-        <w:rPr>
-          <w:rFonts w:ascii="Arial" w:hAnsi="Arial" w:cs="Arial"/>
-          <w:sz w:val="14"/>
-          <w:szCs w:val="14"/>
-          <w:lang w:val="pt-PT"/>
-        </w:rPr>
-        <w:t>/</w:t>
-      </w:r>
-      <w:r>
-        <w:rPr>
-          <w:rFonts w:ascii="Arial" w:hAnsi="Arial" w:cs="Arial"/>
-          <w:sz w:val="14"/>
-          <w:szCs w:val="14"/>
-          <w:lang w:val="pt-PT"/>
-        </w:rPr>
-        <w:t xml:space="preserve">    </w:t>
-      </w:r>
-      <w:r>
-        <w:rPr>
-          <w:rFonts w:ascii="Arial" w:hAnsi="Arial" w:cs="Arial"/>
-          <w:sz w:val="14"/>
-          <w:szCs w:val="14"/>
-          <w:lang w:val="pt-PT"/>
-        </w:rPr>
-        <w:t xml:space="preserve">/    </w:t>
-      </w:r>
-      <w:bookmarkEnd w:id="0"/>
       <w:r>
         <w:rPr>
           <w:rFonts w:ascii="Arial" w:hAnsi="Arial" w:cs="Arial"/>
@@ -453,8 +453,8 @@
         </w:rPr>
         <w:tab/>
       </w:r>
-      <w:bookmarkStart w:id="2" w:name="_Hlk15562154"/>
-      <w:bookmarkStart w:id="3" w:name="_Hlk43303158"/>
+      <w:bookmarkStart w:id="2" w:name="_Hlk43303158"/>
+      <w:bookmarkStart w:id="3" w:name="_Hlk15562154"/>
     </w:p>
     <w:p>
       <w:pPr>
@@ -662,7 +662,7 @@
           <w:sz w:val="14"/>
           <w:szCs w:val="14"/>
         </w:rPr>
-        <w:t>***</w:t>
+        <w:t>{{ nombre_acreditado }}</w:t>
       </w:r>
       <w:r>
         <w:rPr>
@@ -712,7 +712,7 @@
         </w:rPr>
         <w:t>.</w:t>
       </w:r>
-      <w:bookmarkEnd w:id="3"/>
+      <w:bookmarkEnd w:id="2"/>
       <w:r>
         <w:rPr>
           <w:rFonts w:ascii="Arial" w:hAnsi="Arial" w:cs="Arial"/>
@@ -1041,7 +1041,7 @@
         <w:t>--------------------------------------------------------------------------------------------------------------------------------------------------------------------------------------</w:t>
       </w:r>
     </w:p>
-    <w:bookmarkEnd w:id="2"/>
+    <w:bookmarkEnd w:id="3"/>
     <w:p>
       <w:pPr>
         <w:pStyle w:val="Sinespaciado"/>
@@ -1432,384 +1432,473 @@
         <w:spacing w:line="360" w:lineRule="auto"/>
         <w:jc w:val="both"/>
         <w:rPr>
-          <w:rFonts w:ascii="Arial" w:hAnsi="Arial" w:cs="Arial"/>
-          <w:b/>
+          <w:rFonts w:ascii="Arial" w:eastAsia="Batang" w:hAnsi="Arial" w:cs="Arial"/>
+          <w:sz w:val="14"/>
+          <w:szCs w:val="14"/>
+        </w:rPr>
+      </w:pPr>
+      <w:r>
+        <w:rPr>
+          <w:rFonts w:ascii="Arial" w:hAnsi="Arial" w:cs="Arial"/>
           <w:sz w:val="14"/>
           <w:szCs w:val="14"/>
           <w:lang w:val="es-MX"/>
         </w:rPr>
-      </w:pPr>
-      <w:r>
-        <w:rPr>
-          <w:rFonts w:ascii="Arial" w:hAnsi="Arial" w:cs="Arial"/>
+        <w:t xml:space="preserve">-------- </w:t>
+      </w:r>
+      <w:r>
+        <w:rPr>
+          <w:rFonts w:ascii="Arial" w:eastAsia="Batang" w:hAnsi="Arial" w:cs="Arial"/>
+          <w:b/>
+          <w:sz w:val="14"/>
+          <w:szCs w:val="14"/>
+        </w:rPr>
+        <w:t xml:space="preserve">I.- </w:t>
+      </w:r>
+      <w:r>
+        <w:rPr>
+          <w:rFonts w:ascii="Arial" w:eastAsia="Batang" w:hAnsi="Arial" w:cs="Arial"/>
+          <w:b/>
+          <w:sz w:val="14"/>
+          <w:szCs w:val="14"/>
+          <w:lang w:val="es-ES"/>
+        </w:rPr>
+        <w:t>OTORGAMIENTO DE CRÉDITO Y CONSTITUCIÓN DE GARANTÍA HIPOTECARIA</w:t>
+      </w:r>
+      <w:r>
+        <w:rPr>
+          <w:rFonts w:ascii="Arial" w:eastAsia="Batang" w:hAnsi="Arial" w:cs="Arial"/>
+          <w:b/>
+          <w:sz w:val="14"/>
+          <w:szCs w:val="14"/>
+        </w:rPr>
+        <w:t xml:space="preserve">.- </w:t>
+      </w:r>
+      <w:r>
+        <w:rPr>
+          <w:rFonts w:ascii="Arial" w:eastAsia="Batang" w:hAnsi="Arial" w:cs="Arial"/>
+          <w:sz w:val="14"/>
+          <w:szCs w:val="14"/>
+        </w:rPr>
+        <w:t>Por instrumento</w:t>
+      </w:r>
+      <w:r>
+        <w:rPr>
+          <w:rFonts w:ascii="Arial" w:eastAsia="Batang" w:hAnsi="Arial" w:cs="Arial"/>
+          <w:sz w:val="14"/>
+          <w:szCs w:val="14"/>
+        </w:rPr>
+        <w:t xml:space="preserve"> número</w:t>
+      </w:r>
+      <w:r>
+        <w:rPr>
+          <w:rFonts w:ascii="Arial" w:eastAsia="Batang" w:hAnsi="Arial" w:cs="Arial"/>
+          <w:sz w:val="14"/>
+          <w:szCs w:val="14"/>
+        </w:rPr>
+        <w:t xml:space="preserve"> </w:t>
+      </w:r>
+      <w:r>
+        <w:rPr>
+          <w:rFonts w:ascii="Arial" w:eastAsia="Batang" w:hAnsi="Arial" w:cs="Arial"/>
+          <w:b/>
+          <w:bCs/>
+          <w:sz w:val="14"/>
+          <w:szCs w:val="14"/>
+        </w:rPr>
+        <w:t>{{ numero_escritura }}</w:t>
+      </w:r>
+      <w:r>
+        <w:rPr>
+          <w:rFonts w:ascii="Arial" w:eastAsia="Batang" w:hAnsi="Arial" w:cs="Arial"/>
+          <w:sz w:val="14"/>
+          <w:szCs w:val="14"/>
+        </w:rPr>
+        <w:t>, de fecha</w:t>
+      </w:r>
+      <w:r>
+        <w:rPr>
+          <w:rFonts w:ascii="Arial" w:eastAsia="Batang" w:hAnsi="Arial" w:cs="Arial"/>
+          <w:sz w:val="14"/>
+          <w:szCs w:val="14"/>
+        </w:rPr>
+        <w:t xml:space="preserve"> </w:t>
+      </w:r>
+      <w:r>
+        <w:rPr>
+          <w:rFonts w:ascii="Arial" w:eastAsia="Batang" w:hAnsi="Arial" w:cs="Arial"/>
+          <w:sz w:val="14"/>
+          <w:szCs w:val="14"/>
+        </w:rPr>
+        <w:t>{{ fecha_escritura }}</w:t>
+      </w:r>
+      <w:r>
+        <w:rPr>
+          <w:rFonts w:ascii="Arial" w:eastAsia="Batang" w:hAnsi="Arial" w:cs="Arial"/>
+          <w:sz w:val="14"/>
+          <w:szCs w:val="14"/>
+        </w:rPr>
+        <w:t xml:space="preserve">, </w:t>
+      </w:r>
+      <w:bookmarkStart w:id="4" w:name="_Hlk150602556"/>
+      <w:r>
+        <w:rPr>
+          <w:rFonts w:ascii="Arial" w:eastAsia="Batang" w:hAnsi="Arial" w:cs="Arial"/>
+          <w:sz w:val="14"/>
+          <w:szCs w:val="14"/>
+          <w:lang w:val="es-ES"/>
+        </w:rPr>
+        <w:t>otorgado ante la fe del Licenciado</w:t>
+      </w:r>
+      <w:r>
+        <w:rPr>
+          <w:rFonts w:ascii="Arial" w:eastAsia="Batang" w:hAnsi="Arial" w:cs="Arial"/>
+          <w:sz w:val="14"/>
+          <w:szCs w:val="14"/>
+          <w:lang w:val="es-ES"/>
+        </w:rPr>
+        <w:t xml:space="preserve"> </w:t>
+      </w:r>
+      <w:r>
+        <w:rPr>
+          <w:rFonts w:ascii="Arial" w:eastAsia="Batang" w:hAnsi="Arial" w:cs="Arial"/>
+          <w:sz w:val="14"/>
+          <w:szCs w:val="14"/>
+          <w:lang w:val="es-ES"/>
+        </w:rPr>
+        <w:t>{{ notario_origen_completo }}</w:t>
+      </w:r>
+      <w:r>
+        <w:rPr>
+          <w:rFonts w:ascii="Arial" w:eastAsia="Batang" w:hAnsi="Arial" w:cs="Arial"/>
+          <w:sz w:val="14"/>
+          <w:szCs w:val="14"/>
+          <w:lang w:val="es-ES"/>
+        </w:rPr>
+        <w:t>,</w:t>
+      </w:r>
+      <w:bookmarkEnd w:id="4"/>
+      <w:r>
+        <w:rPr>
+          <w:rFonts w:ascii="Arial" w:eastAsia="Batang" w:hAnsi="Arial" w:cs="Arial"/>
+          <w:sz w:val="14"/>
+          <w:szCs w:val="14"/>
+        </w:rPr>
+        <w:t xml:space="preserve"> se hizo constar entre otros actos, </w:t>
+      </w:r>
+      <w:r>
+        <w:rPr>
+          <w:rFonts w:ascii="Arial" w:eastAsia="Batang" w:hAnsi="Arial" w:cs="Arial"/>
+          <w:bCs/>
+          <w:sz w:val="14"/>
+          <w:szCs w:val="14"/>
+        </w:rPr>
+        <w:t>el otorgamiento de crédito y constitución de garantía hipotecaria</w:t>
+      </w:r>
+      <w:r>
+        <w:rPr>
+          <w:rFonts w:ascii="Arial" w:eastAsia="Batang" w:hAnsi="Arial" w:cs="Arial"/>
+          <w:sz w:val="14"/>
+          <w:szCs w:val="14"/>
+        </w:rPr>
+        <w:t xml:space="preserve">, </w:t>
+      </w:r>
+      <w:r>
+        <w:rPr>
+          <w:rFonts w:ascii="Arial" w:eastAsia="Batang" w:hAnsi="Arial" w:cs="Arial"/>
+          <w:sz w:val="14"/>
+          <w:szCs w:val="14"/>
+        </w:rPr>
+        <w:t>por medio del cual</w:t>
+      </w:r>
+      <w:r>
+        <w:rPr>
+          <w:rFonts w:ascii="Arial" w:eastAsia="Batang" w:hAnsi="Arial" w:cs="Arial"/>
+          <w:sz w:val="14"/>
+          <w:szCs w:val="14"/>
+        </w:rPr>
+        <w:t xml:space="preserve"> el</w:t>
+      </w:r>
+      <w:r>
+        <w:rPr>
+          <w:rFonts w:ascii="Arial" w:eastAsia="Batang" w:hAnsi="Arial" w:cs="Arial"/>
+          <w:sz w:val="14"/>
+          <w:szCs w:val="14"/>
+        </w:rPr>
+        <w:t xml:space="preserve"> </w:t>
+      </w:r>
+      <w:r>
+        <w:rPr>
+          <w:rFonts w:ascii="Arial" w:eastAsia="Batang" w:hAnsi="Arial" w:cs="Arial"/>
+          <w:b/>
+          <w:sz w:val="14"/>
+          <w:szCs w:val="14"/>
+        </w:rPr>
+        <w:t xml:space="preserve">INSTITUTO DEL FONDO NACIONAL </w:t>
+      </w:r>
+      <w:r>
+        <w:rPr>
+          <w:rFonts w:ascii="Arial" w:eastAsia="Batang" w:hAnsi="Arial" w:cs="Arial"/>
+          <w:b/>
+          <w:sz w:val="14"/>
+          <w:szCs w:val="14"/>
+        </w:rPr>
+        <w:t xml:space="preserve">DE LA VIVIENDA </w:t>
+      </w:r>
+      <w:r>
+        <w:rPr>
+          <w:rFonts w:ascii="Arial" w:eastAsia="Batang" w:hAnsi="Arial" w:cs="Arial"/>
+          <w:b/>
+          <w:sz w:val="14"/>
+          <w:szCs w:val="14"/>
+        </w:rPr>
+        <w:t>PARA LOS TRABAJADORES</w:t>
+      </w:r>
+      <w:r>
+        <w:rPr>
+          <w:rFonts w:ascii="Arial" w:eastAsia="Batang" w:hAnsi="Arial" w:cs="Arial"/>
+          <w:sz w:val="14"/>
+          <w:szCs w:val="14"/>
+        </w:rPr>
+        <w:t>,</w:t>
+      </w:r>
+      <w:r>
+        <w:rPr>
+          <w:rFonts w:ascii="Arial" w:eastAsia="Batang" w:hAnsi="Arial" w:cs="Arial"/>
+          <w:b/>
+          <w:sz w:val="14"/>
+          <w:szCs w:val="14"/>
+        </w:rPr>
+        <w:t xml:space="preserve"> </w:t>
+      </w:r>
+      <w:r>
+        <w:rPr>
+          <w:rFonts w:ascii="Arial" w:eastAsia="Batang" w:hAnsi="Arial" w:cs="Arial"/>
+          <w:sz w:val="14"/>
+          <w:szCs w:val="14"/>
+        </w:rPr>
+        <w:t>otorg</w:t>
+      </w:r>
+      <w:r>
+        <w:rPr>
+          <w:rFonts w:ascii="Arial" w:eastAsia="Batang" w:hAnsi="Arial" w:cs="Arial"/>
+          <w:sz w:val="14"/>
+          <w:szCs w:val="14"/>
+        </w:rPr>
+        <w:t>ó</w:t>
+      </w:r>
+      <w:r>
+        <w:rPr>
+          <w:rFonts w:ascii="Arial" w:eastAsia="Batang" w:hAnsi="Arial" w:cs="Arial"/>
+          <w:sz w:val="14"/>
+          <w:szCs w:val="14"/>
+        </w:rPr>
+        <w:t xml:space="preserve"> a</w:t>
+      </w:r>
+      <w:r>
+        <w:rPr>
+          <w:rFonts w:ascii="Arial" w:eastAsia="Batang" w:hAnsi="Arial" w:cs="Arial"/>
+          <w:sz w:val="14"/>
+          <w:szCs w:val="14"/>
+        </w:rPr>
+        <w:t>l señor</w:t>
+      </w:r>
+      <w:r>
+        <w:rPr>
+          <w:rFonts w:ascii="Arial" w:eastAsia="Batang" w:hAnsi="Arial" w:cs="Arial"/>
+          <w:sz w:val="14"/>
+          <w:szCs w:val="14"/>
+        </w:rPr>
+        <w:t xml:space="preserve"> </w:t>
+      </w:r>
+      <w:r>
+        <w:rPr>
+          <w:rFonts w:ascii="Arial" w:eastAsia="Batang" w:hAnsi="Arial" w:cs="Arial"/>
+          <w:b/>
+          <w:bCs/>
+          <w:sz w:val="14"/>
+          <w:szCs w:val="14"/>
+        </w:rPr>
+        <w:t>{{ nombre_acreditado }}</w:t>
+      </w:r>
+      <w:r>
+        <w:rPr>
+          <w:rFonts w:ascii="Arial" w:hAnsi="Arial" w:cs="Arial"/>
+          <w:bCs/>
+          <w:sz w:val="14"/>
+          <w:szCs w:val="14"/>
+        </w:rPr>
+        <w:t xml:space="preserve">, </w:t>
+      </w:r>
+      <w:r>
+        <w:rPr>
+          <w:rFonts w:ascii="Arial" w:eastAsia="Batang" w:hAnsi="Arial" w:cs="Arial"/>
+          <w:bCs/>
+          <w:sz w:val="14"/>
+          <w:szCs w:val="14"/>
+        </w:rPr>
+        <w:t xml:space="preserve">un crédito </w:t>
+      </w:r>
+      <w:r>
+        <w:rPr>
+          <w:rFonts w:ascii="Arial" w:eastAsia="Batang" w:hAnsi="Arial" w:cs="Arial"/>
+          <w:sz w:val="14"/>
+          <w:szCs w:val="14"/>
+        </w:rPr>
+        <w:t>hasta</w:t>
+      </w:r>
+      <w:r>
+        <w:rPr>
+          <w:rFonts w:ascii="Arial" w:eastAsia="Batang" w:hAnsi="Arial" w:cs="Arial"/>
+          <w:sz w:val="14"/>
+          <w:szCs w:val="14"/>
+        </w:rPr>
+        <w:t xml:space="preserve"> por</w:t>
+      </w:r>
+      <w:r>
+        <w:rPr>
+          <w:rFonts w:ascii="Arial" w:eastAsia="Batang" w:hAnsi="Arial" w:cs="Arial"/>
+          <w:sz w:val="14"/>
+          <w:szCs w:val="14"/>
+        </w:rPr>
+        <w:t xml:space="preserve"> </w:t>
+      </w:r>
+      <w:r>
+        <w:rPr>
+          <w:rFonts w:ascii="Arial" w:eastAsia="Batang" w:hAnsi="Arial" w:cs="Arial"/>
+          <w:sz w:val="14"/>
+          <w:szCs w:val="14"/>
+        </w:rPr>
+        <w:t>{{ crédito_a_salario }}</w:t>
+      </w:r>
+      <w:r>
+        <w:rPr>
+          <w:rFonts w:ascii="Arial" w:eastAsia="Batang" w:hAnsi="Arial" w:cs="Arial"/>
+          <w:sz w:val="14"/>
+          <w:szCs w:val="14"/>
+        </w:rPr>
+        <w:t xml:space="preserve"> </w:t>
+      </w:r>
+      <w:r>
+        <w:rPr>
+          <w:rFonts w:ascii="Arial" w:eastAsia="Batang" w:hAnsi="Arial" w:cs="Arial"/>
+          <w:sz w:val="14"/>
+          <w:szCs w:val="14"/>
+        </w:rPr>
+        <w:t xml:space="preserve">veces el salario mínimo mensual </w:t>
+      </w:r>
+      <w:r>
+        <w:rPr>
+          <w:rFonts w:ascii="Arial" w:hAnsi="Arial" w:cs="Arial"/>
+          <w:bCs/>
+          <w:sz w:val="14"/>
+          <w:szCs w:val="14"/>
+        </w:rPr>
+        <w:t>v</w:t>
+      </w:r>
+      <w:r>
+        <w:rPr>
+          <w:rFonts w:ascii="Arial" w:eastAsia="Batang" w:hAnsi="Arial" w:cs="Arial"/>
+          <w:sz w:val="14"/>
+          <w:szCs w:val="14"/>
+        </w:rPr>
+        <w:t>igente en ese entonces en el Distrito Federal</w:t>
+      </w:r>
+      <w:r>
+        <w:rPr>
+          <w:rFonts w:ascii="Arial" w:eastAsia="Batang" w:hAnsi="Arial" w:cs="Arial"/>
+          <w:b/>
+          <w:bCs/>
+          <w:iCs/>
           <w:sz w:val="14"/>
           <w:szCs w:val="14"/>
           <w:lang w:val="es-MX"/>
         </w:rPr>
-        <w:t xml:space="preserve">-------- </w:t>
-      </w:r>
-      <w:r>
-        <w:rPr>
-          <w:rFonts w:ascii="Arial" w:eastAsia="Batang" w:hAnsi="Arial" w:cs="Arial"/>
-          <w:b/>
-          <w:sz w:val="14"/>
-          <w:szCs w:val="14"/>
-        </w:rPr>
-        <w:t xml:space="preserve">I.- </w:t>
-      </w:r>
-      <w:r>
-        <w:rPr>
-          <w:rFonts w:ascii="Arial" w:eastAsia="Batang" w:hAnsi="Arial" w:cs="Arial"/>
-          <w:b/>
-          <w:sz w:val="14"/>
-          <w:szCs w:val="14"/>
-          <w:lang w:val="es-ES"/>
-        </w:rPr>
-        <w:t>OTORGAMIENTO DE CRÉDITO Y CONSTITUCIÓN DE GARANTÍA HIPOTECARIA</w:t>
-      </w:r>
-      <w:r>
-        <w:rPr>
-          <w:rFonts w:ascii="Arial" w:eastAsia="Batang" w:hAnsi="Arial" w:cs="Arial"/>
-          <w:b/>
-          <w:sz w:val="14"/>
-          <w:szCs w:val="14"/>
-        </w:rPr>
-        <w:t xml:space="preserve">.- </w:t>
-      </w:r>
-      <w:r>
-        <w:rPr>
-          <w:rFonts w:ascii="Arial" w:eastAsia="Batang" w:hAnsi="Arial" w:cs="Arial"/>
-          <w:sz w:val="14"/>
-          <w:szCs w:val="14"/>
-        </w:rPr>
-        <w:t>Por instrumento</w:t>
-      </w:r>
-      <w:r>
-        <w:rPr>
-          <w:rFonts w:ascii="Arial" w:eastAsia="Batang" w:hAnsi="Arial" w:cs="Arial"/>
-          <w:sz w:val="14"/>
-          <w:szCs w:val="14"/>
-        </w:rPr>
-        <w:t xml:space="preserve"> número        </w:t>
-      </w:r>
-      <w:r>
-        <w:rPr>
-          <w:rFonts w:ascii="Arial" w:eastAsia="Batang" w:hAnsi="Arial" w:cs="Arial"/>
-          <w:sz w:val="14"/>
-          <w:szCs w:val="14"/>
-        </w:rPr>
-        <w:t>, de fecha</w:t>
-      </w:r>
-      <w:r>
-        <w:rPr>
-          <w:rFonts w:ascii="Arial" w:eastAsia="Batang" w:hAnsi="Arial" w:cs="Arial"/>
-          <w:sz w:val="14"/>
-          <w:szCs w:val="14"/>
-        </w:rPr>
-        <w:t xml:space="preserve">       </w:t>
-      </w:r>
-      <w:r>
-        <w:rPr>
-          <w:rFonts w:ascii="Arial" w:eastAsia="Batang" w:hAnsi="Arial" w:cs="Arial"/>
-          <w:sz w:val="14"/>
-          <w:szCs w:val="14"/>
-        </w:rPr>
         <w:t xml:space="preserve">, </w:t>
       </w:r>
-      <w:bookmarkStart w:id="4" w:name="_Hlk150602556"/>
-      <w:r>
-        <w:rPr>
-          <w:rFonts w:ascii="Arial" w:eastAsia="Batang" w:hAnsi="Arial" w:cs="Arial"/>
-          <w:sz w:val="14"/>
-          <w:szCs w:val="14"/>
-          <w:lang w:val="es-ES"/>
-        </w:rPr>
-        <w:t>otorgado ante la fe del Licenciado</w:t>
-      </w:r>
-      <w:r>
-        <w:rPr>
-          <w:rFonts w:ascii="Arial" w:eastAsia="Batang" w:hAnsi="Arial" w:cs="Arial"/>
-          <w:sz w:val="14"/>
-          <w:szCs w:val="14"/>
-          <w:lang w:val="es-ES"/>
-        </w:rPr>
-        <w:t xml:space="preserve">                                </w:t>
-      </w:r>
-      <w:r>
-        <w:rPr>
-          <w:rFonts w:ascii="Arial" w:eastAsia="Batang" w:hAnsi="Arial" w:cs="Arial"/>
-          <w:sz w:val="14"/>
-          <w:szCs w:val="14"/>
-          <w:lang w:val="es-ES"/>
-        </w:rPr>
-        <w:t>,</w:t>
-      </w:r>
-      <w:bookmarkEnd w:id="4"/>
-      <w:r>
-        <w:rPr>
-          <w:rFonts w:ascii="Arial" w:eastAsia="Batang" w:hAnsi="Arial" w:cs="Arial"/>
-          <w:sz w:val="14"/>
-          <w:szCs w:val="14"/>
-        </w:rPr>
-        <w:t xml:space="preserve"> se hizo constar entre otros actos, </w:t>
-      </w:r>
-      <w:r>
-        <w:rPr>
-          <w:rFonts w:ascii="Arial" w:eastAsia="Batang" w:hAnsi="Arial" w:cs="Arial"/>
-          <w:bCs/>
-          <w:sz w:val="14"/>
-          <w:szCs w:val="14"/>
-        </w:rPr>
-        <w:t>el otorgamiento de crédito y constitución de garantía hipotecaria</w:t>
-      </w:r>
-      <w:r>
-        <w:rPr>
-          <w:rFonts w:ascii="Arial" w:eastAsia="Batang" w:hAnsi="Arial" w:cs="Arial"/>
-          <w:sz w:val="14"/>
-          <w:szCs w:val="14"/>
-        </w:rPr>
-        <w:t xml:space="preserve">, </w:t>
-      </w:r>
-      <w:r>
-        <w:rPr>
-          <w:rFonts w:ascii="Arial" w:eastAsia="Batang" w:hAnsi="Arial" w:cs="Arial"/>
-          <w:sz w:val="14"/>
-          <w:szCs w:val="14"/>
-        </w:rPr>
-        <w:t>por medio del cual</w:t>
-      </w:r>
-      <w:r>
-        <w:rPr>
-          <w:rFonts w:ascii="Arial" w:eastAsia="Batang" w:hAnsi="Arial" w:cs="Arial"/>
-          <w:sz w:val="14"/>
-          <w:szCs w:val="14"/>
-        </w:rPr>
-        <w:t xml:space="preserve"> el</w:t>
-      </w:r>
-      <w:r>
-        <w:rPr>
-          <w:rFonts w:ascii="Arial" w:eastAsia="Batang" w:hAnsi="Arial" w:cs="Arial"/>
-          <w:sz w:val="14"/>
-          <w:szCs w:val="14"/>
+      <w:r>
+        <w:rPr>
+          <w:rFonts w:ascii="Arial" w:eastAsia="Batang" w:hAnsi="Arial" w:cs="Arial"/>
+          <w:iCs/>
+          <w:sz w:val="14"/>
+          <w:szCs w:val="14"/>
+          <w:lang w:val="es-MX"/>
+        </w:rPr>
+        <w:t>equivalente a esa fecha a la cantidad</w:t>
+      </w:r>
+      <w:r>
+        <w:rPr>
+          <w:rFonts w:ascii="Arial" w:eastAsia="Batang" w:hAnsi="Arial" w:cs="Arial"/>
+          <w:iCs/>
+          <w:sz w:val="14"/>
+          <w:szCs w:val="14"/>
+          <w:lang w:val="es-MX"/>
+        </w:rPr>
+        <w:t xml:space="preserve"> de </w:t>
+      </w:r>
+      <w:r>
+        <w:rPr>
+          <w:rFonts w:ascii="Arial" w:eastAsia="Batang" w:hAnsi="Arial" w:cs="Arial"/>
+          <w:b/>
+          <w:bCs/>
+          <w:iCs/>
+          <w:sz w:val="14"/>
+          <w:szCs w:val="14"/>
+          <w:lang w:val="es-MX"/>
+        </w:rPr>
+        <w:t>{{ monto_credito }}</w:t>
+      </w:r>
+      <w:r>
+        <w:rPr>
+          <w:rFonts w:ascii="Arial" w:eastAsia="Batang" w:hAnsi="Arial" w:cs="Arial"/>
+          <w:b/>
+          <w:bCs/>
+          <w:iCs/>
+          <w:sz w:val="14"/>
+          <w:szCs w:val="14"/>
+          <w:lang w:val="es-MX"/>
         </w:rPr>
         <w:t xml:space="preserve"> </w:t>
       </w:r>
       <w:r>
         <w:rPr>
           <w:rFonts w:ascii="Arial" w:eastAsia="Batang" w:hAnsi="Arial" w:cs="Arial"/>
-          <w:b/>
-          <w:sz w:val="14"/>
-          <w:szCs w:val="14"/>
-        </w:rPr>
-        <w:t xml:space="preserve">INSTITUTO DEL FONDO NACIONAL </w:t>
-      </w:r>
-      <w:r>
-        <w:rPr>
-          <w:rFonts w:ascii="Arial" w:eastAsia="Batang" w:hAnsi="Arial" w:cs="Arial"/>
-          <w:b/>
-          <w:sz w:val="14"/>
-          <w:szCs w:val="14"/>
-        </w:rPr>
-        <w:t xml:space="preserve">DE LA VIVIENDA </w:t>
-      </w:r>
-      <w:r>
-        <w:rPr>
-          <w:rFonts w:ascii="Arial" w:eastAsia="Batang" w:hAnsi="Arial" w:cs="Arial"/>
-          <w:b/>
-          <w:sz w:val="14"/>
-          <w:szCs w:val="14"/>
-        </w:rPr>
-        <w:t>PARA LOS TRABAJADORES</w:t>
-      </w:r>
-      <w:r>
-        <w:rPr>
-          <w:rFonts w:ascii="Arial" w:eastAsia="Batang" w:hAnsi="Arial" w:cs="Arial"/>
-          <w:sz w:val="14"/>
-          <w:szCs w:val="14"/>
-        </w:rPr>
-        <w:t>,</w:t>
-      </w:r>
-      <w:r>
-        <w:rPr>
-          <w:rFonts w:ascii="Arial" w:eastAsia="Batang" w:hAnsi="Arial" w:cs="Arial"/>
-          <w:b/>
-          <w:sz w:val="14"/>
-          <w:szCs w:val="14"/>
-        </w:rPr>
-        <w:t xml:space="preserve"> </w:t>
-      </w:r>
-      <w:r>
-        <w:rPr>
-          <w:rFonts w:ascii="Arial" w:eastAsia="Batang" w:hAnsi="Arial" w:cs="Arial"/>
-          <w:sz w:val="14"/>
-          <w:szCs w:val="14"/>
-        </w:rPr>
-        <w:t>otorg</w:t>
-      </w:r>
-      <w:r>
-        <w:rPr>
-          <w:rFonts w:ascii="Arial" w:eastAsia="Batang" w:hAnsi="Arial" w:cs="Arial"/>
-          <w:sz w:val="14"/>
-          <w:szCs w:val="14"/>
-        </w:rPr>
-        <w:t>ó</w:t>
-      </w:r>
-      <w:r>
-        <w:rPr>
-          <w:rFonts w:ascii="Arial" w:eastAsia="Batang" w:hAnsi="Arial" w:cs="Arial"/>
-          <w:sz w:val="14"/>
-          <w:szCs w:val="14"/>
-        </w:rPr>
-        <w:t xml:space="preserve"> a</w:t>
-      </w:r>
-      <w:r>
-        <w:rPr>
-          <w:rFonts w:ascii="Arial" w:eastAsia="Batang" w:hAnsi="Arial" w:cs="Arial"/>
-          <w:sz w:val="14"/>
-          <w:szCs w:val="14"/>
-        </w:rPr>
-        <w:t>l señor</w:t>
-      </w:r>
-      <w:r>
-        <w:rPr>
-          <w:rFonts w:ascii="Arial" w:eastAsia="Batang" w:hAnsi="Arial" w:cs="Arial"/>
-          <w:sz w:val="14"/>
-          <w:szCs w:val="14"/>
-        </w:rPr>
-        <w:t xml:space="preserve"> </w:t>
-      </w:r>
-      <w:r>
-        <w:rPr>
-          <w:rFonts w:ascii="Arial" w:hAnsi="Arial" w:cs="Arial"/>
-          <w:b/>
-          <w:bCs/>
-          <w:sz w:val="14"/>
-          <w:szCs w:val="14"/>
-        </w:rPr>
-        <w:t>***</w:t>
-      </w:r>
-      <w:r>
-        <w:rPr>
-          <w:rFonts w:ascii="Arial" w:hAnsi="Arial" w:cs="Arial"/>
-          <w:bCs/>
-          <w:sz w:val="14"/>
-          <w:szCs w:val="14"/>
-        </w:rPr>
-        <w:t xml:space="preserve">, </w:t>
-      </w:r>
-      <w:r>
-        <w:rPr>
-          <w:rFonts w:ascii="Arial" w:eastAsia="Batang" w:hAnsi="Arial" w:cs="Arial"/>
-          <w:bCs/>
-          <w:sz w:val="14"/>
-          <w:szCs w:val="14"/>
-        </w:rPr>
-        <w:t xml:space="preserve">un crédito </w:t>
-      </w:r>
-      <w:r>
-        <w:rPr>
-          <w:rFonts w:ascii="Arial" w:eastAsia="Batang" w:hAnsi="Arial" w:cs="Arial"/>
-          <w:sz w:val="14"/>
-          <w:szCs w:val="14"/>
-        </w:rPr>
-        <w:t>hasta</w:t>
-      </w:r>
-      <w:r>
-        <w:rPr>
-          <w:rFonts w:ascii="Arial" w:eastAsia="Batang" w:hAnsi="Arial" w:cs="Arial"/>
-          <w:sz w:val="14"/>
-          <w:szCs w:val="14"/>
-        </w:rPr>
-        <w:t xml:space="preserve"> por</w:t>
-      </w:r>
-      <w:r>
-        <w:rPr>
-          <w:rFonts w:ascii="Arial" w:eastAsia="Batang" w:hAnsi="Arial" w:cs="Arial"/>
-          <w:sz w:val="14"/>
-          <w:szCs w:val="14"/>
-        </w:rPr>
-        <w:t xml:space="preserve">                          </w:t>
-      </w:r>
-      <w:r>
-        <w:rPr>
-          <w:rFonts w:ascii="Arial" w:eastAsia="Batang" w:hAnsi="Arial" w:cs="Arial"/>
-          <w:sz w:val="14"/>
-          <w:szCs w:val="14"/>
-        </w:rPr>
-        <w:t xml:space="preserve"> veces el salario mínimo mensual </w:t>
-      </w:r>
-      <w:r>
-        <w:rPr>
-          <w:rFonts w:ascii="Arial" w:hAnsi="Arial" w:cs="Arial"/>
-          <w:bCs/>
-          <w:sz w:val="14"/>
-          <w:szCs w:val="14"/>
-        </w:rPr>
-        <w:t>v</w:t>
-      </w:r>
-      <w:r>
-        <w:rPr>
-          <w:rFonts w:ascii="Arial" w:eastAsia="Batang" w:hAnsi="Arial" w:cs="Arial"/>
-          <w:sz w:val="14"/>
-          <w:szCs w:val="14"/>
-        </w:rPr>
-        <w:t>igente en ese entonces en el Distrito Federal</w:t>
-      </w:r>
-      <w:r>
-        <w:rPr>
-          <w:rFonts w:ascii="Arial" w:eastAsia="Batang" w:hAnsi="Arial" w:cs="Arial"/>
-          <w:b/>
-          <w:bCs/>
-          <w:iCs/>
-          <w:sz w:val="14"/>
-          <w:szCs w:val="14"/>
-          <w:lang w:val="es-MX"/>
-        </w:rPr>
-        <w:t xml:space="preserve">, </w:t>
-      </w:r>
-      <w:r>
-        <w:rPr>
-          <w:rFonts w:ascii="Arial" w:eastAsia="Batang" w:hAnsi="Arial" w:cs="Arial"/>
-          <w:iCs/>
-          <w:sz w:val="14"/>
-          <w:szCs w:val="14"/>
-          <w:lang w:val="es-MX"/>
-        </w:rPr>
-        <w:t>equivalente a esa fecha a la cantidad</w:t>
-      </w:r>
-      <w:r>
-        <w:rPr>
-          <w:rFonts w:ascii="Arial" w:eastAsia="Batang" w:hAnsi="Arial" w:cs="Arial"/>
-          <w:iCs/>
-          <w:sz w:val="14"/>
-          <w:szCs w:val="14"/>
-          <w:lang w:val="es-MX"/>
-        </w:rPr>
-        <w:t xml:space="preserve"> de </w:t>
-      </w:r>
-      <w:r>
-        <w:rPr>
-          <w:rFonts w:ascii="Arial" w:eastAsia="Batang" w:hAnsi="Arial" w:cs="Arial"/>
-          <w:b/>
-          <w:bCs/>
-          <w:iCs/>
-          <w:sz w:val="14"/>
-          <w:szCs w:val="14"/>
-          <w:lang w:val="es-MX"/>
-        </w:rPr>
-        <w:t>$</w:t>
-      </w:r>
-      <w:r>
-        <w:rPr>
-          <w:rFonts w:ascii="Arial" w:eastAsia="Batang" w:hAnsi="Arial" w:cs="Arial"/>
-          <w:b/>
-          <w:bCs/>
-          <w:iCs/>
-          <w:sz w:val="14"/>
-          <w:szCs w:val="14"/>
-          <w:lang w:val="es-MX"/>
-        </w:rPr>
-        <w:t xml:space="preserve">              </w:t>
+          <w:sz w:val="14"/>
+          <w:szCs w:val="14"/>
+        </w:rPr>
+        <w:t xml:space="preserve">con los intereses y demás </w:t>
+      </w:r>
+      <w:r>
+        <w:rPr>
+          <w:rFonts w:ascii="Arial" w:eastAsia="Batang" w:hAnsi="Arial" w:cs="Arial"/>
+          <w:sz w:val="14"/>
+          <w:szCs w:val="14"/>
+        </w:rPr>
+        <w:t xml:space="preserve">accesorios legales </w:t>
+      </w:r>
+      <w:r>
+        <w:rPr>
+          <w:rFonts w:ascii="Arial" w:eastAsia="Batang" w:hAnsi="Arial" w:cs="Arial"/>
+          <w:sz w:val="14"/>
+          <w:szCs w:val="14"/>
+        </w:rPr>
+        <w:t>ahí precisado</w:t>
+      </w:r>
+      <w:r>
+        <w:rPr>
+          <w:rFonts w:ascii="Arial" w:eastAsia="Batang" w:hAnsi="Arial" w:cs="Arial"/>
+          <w:sz w:val="14"/>
+          <w:szCs w:val="14"/>
+        </w:rPr>
+        <w:t>s.</w:t>
+      </w:r>
+      <w:r>
+        <w:rPr>
+          <w:rFonts w:ascii="Arial" w:eastAsia="Batang" w:hAnsi="Arial" w:cs="Arial"/>
+          <w:sz w:val="14"/>
+          <w:szCs w:val="14"/>
+        </w:rPr>
+        <w:tab/>
       </w:r>
     </w:p>
     <w:p>
@@ -1824,42 +1913,325 @@
         <w:jc w:val="both"/>
         <w:rPr>
           <w:rFonts w:ascii="Arial" w:eastAsia="Batang" w:hAnsi="Arial" w:cs="Arial"/>
-          <w:b/>
-          <w:bCs/>
-          <w:iCs/>
-          <w:sz w:val="14"/>
-          <w:szCs w:val="14"/>
-          <w:lang w:val="es-MX"/>
-        </w:rPr>
-      </w:pPr>
-      <w:r>
-        <w:rPr>
-          <w:rFonts w:ascii="Arial" w:eastAsia="Batang" w:hAnsi="Arial" w:cs="Arial"/>
-          <w:b/>
-          <w:bCs/>
-          <w:iCs/>
-          <w:sz w:val="14"/>
-          <w:szCs w:val="14"/>
-          <w:lang w:val="es-MX"/>
-        </w:rPr>
-        <w:t>M.N. (</w:t>
-      </w:r>
-      <w:r>
-        <w:rPr>
-          <w:rFonts w:ascii="Arial" w:eastAsia="Batang" w:hAnsi="Arial" w:cs="Arial"/>
-          <w:b/>
-          <w:bCs/>
-          <w:iCs/>
-          <w:sz w:val="14"/>
-          <w:szCs w:val="14"/>
-          <w:lang w:val="es-MX"/>
-        </w:rPr>
-        <w:t xml:space="preserve">                                            </w:t>
+          <w:sz w:val="14"/>
+          <w:szCs w:val="14"/>
+        </w:rPr>
+      </w:pPr>
+      <w:r>
+        <w:rPr>
+          <w:rFonts w:ascii="Arial" w:eastAsia="Batang" w:hAnsi="Arial" w:cs="Arial"/>
+          <w:sz w:val="14"/>
+          <w:szCs w:val="14"/>
+        </w:rPr>
+        <w:t>---</w:t>
+      </w:r>
+      <w:r>
+        <w:rPr>
+          <w:rFonts w:ascii="Arial" w:eastAsia="Batang" w:hAnsi="Arial" w:cs="Arial"/>
+          <w:sz w:val="14"/>
+          <w:szCs w:val="14"/>
+        </w:rPr>
+        <w:t xml:space="preserve">----- </w:t>
+      </w:r>
+      <w:r>
+        <w:rPr>
+          <w:rFonts w:ascii="Arial" w:eastAsia="Batang" w:hAnsi="Arial" w:cs="Arial"/>
+          <w:sz w:val="14"/>
+          <w:szCs w:val="14"/>
+        </w:rPr>
+        <w:t>P</w:t>
+      </w:r>
+      <w:r>
+        <w:rPr>
+          <w:rFonts w:ascii="Arial" w:eastAsia="Batang" w:hAnsi="Arial" w:cs="Arial"/>
+          <w:sz w:val="14"/>
+          <w:szCs w:val="14"/>
+        </w:rPr>
+        <w:t xml:space="preserve">ara garantizar el puntual y preferente pago del adeudo, </w:t>
+      </w:r>
+      <w:r>
+        <w:rPr>
+          <w:rFonts w:ascii="Arial" w:hAnsi="Arial" w:cs="Arial"/>
+          <w:bCs/>
+          <w:sz w:val="14"/>
+          <w:szCs w:val="14"/>
+        </w:rPr>
+        <w:t>“</w:t>
+      </w:r>
+      <w:r>
+        <w:rPr>
+          <w:rFonts w:ascii="Arial" w:hAnsi="Arial" w:cs="Arial"/>
+          <w:b/>
+          <w:sz w:val="14"/>
+          <w:szCs w:val="14"/>
+        </w:rPr>
+        <w:t>EL ACREDITADO</w:t>
+      </w:r>
+      <w:r>
+        <w:rPr>
+          <w:rFonts w:ascii="Arial" w:hAnsi="Arial" w:cs="Arial"/>
+          <w:bCs/>
+          <w:sz w:val="14"/>
+          <w:szCs w:val="14"/>
+        </w:rPr>
+        <w:t>”</w:t>
+      </w:r>
+      <w:r>
+        <w:rPr>
+          <w:rFonts w:ascii="Arial" w:hAnsi="Arial" w:cs="Arial"/>
+          <w:b/>
+          <w:bCs/>
+          <w:sz w:val="14"/>
+          <w:szCs w:val="14"/>
+          <w:lang w:val="es-ES"/>
+        </w:rPr>
+        <w:t>,</w:t>
+      </w:r>
+      <w:r>
+        <w:rPr>
+          <w:rFonts w:ascii="Arial" w:eastAsia="Batang" w:hAnsi="Arial" w:cs="Arial"/>
+          <w:bCs/>
+          <w:sz w:val="14"/>
+          <w:szCs w:val="14"/>
+        </w:rPr>
+        <w:t xml:space="preserve"> </w:t>
+      </w:r>
+      <w:r>
+        <w:rPr>
+          <w:rFonts w:ascii="Arial" w:eastAsia="Batang" w:hAnsi="Arial" w:cs="Arial"/>
+          <w:bCs/>
+          <w:sz w:val="14"/>
+          <w:szCs w:val="14"/>
+        </w:rPr>
+        <w:t xml:space="preserve">con el consentimiento de su cónyuge la señora </w:t>
+      </w:r>
+      <w:r>
+        <w:rPr>
+          <w:rFonts w:ascii="Arial" w:eastAsia="Batang" w:hAnsi="Arial" w:cs="Arial"/>
+          <w:b/>
+          <w:sz w:val="14"/>
+          <w:szCs w:val="14"/>
+        </w:rPr>
+        <w:t>{{ nombre_conyugue }}</w:t>
+      </w:r>
+      <w:r>
+        <w:rPr>
+          <w:rFonts w:ascii="Arial" w:eastAsia="Batang" w:hAnsi="Arial" w:cs="Arial"/>
+          <w:bCs/>
+          <w:sz w:val="14"/>
+          <w:szCs w:val="14"/>
+        </w:rPr>
+        <w:t xml:space="preserve">, </w:t>
+      </w:r>
+      <w:r>
+        <w:rPr>
+          <w:rFonts w:ascii="Arial" w:eastAsia="Batang" w:hAnsi="Arial" w:cs="Arial"/>
+          <w:sz w:val="14"/>
+          <w:szCs w:val="14"/>
+        </w:rPr>
+        <w:t>constituy</w:t>
+      </w:r>
+      <w:r>
+        <w:rPr>
+          <w:rFonts w:ascii="Arial" w:eastAsia="Batang" w:hAnsi="Arial" w:cs="Arial"/>
+          <w:sz w:val="14"/>
+          <w:szCs w:val="14"/>
+        </w:rPr>
+        <w:t>ó</w:t>
+      </w:r>
+      <w:r>
+        <w:rPr>
+          <w:rFonts w:ascii="Arial" w:eastAsia="Batang" w:hAnsi="Arial" w:cs="Arial"/>
+          <w:sz w:val="14"/>
+          <w:szCs w:val="14"/>
+        </w:rPr>
+        <w:t xml:space="preserve"> </w:t>
+      </w:r>
+      <w:r>
+        <w:rPr>
+          <w:rFonts w:ascii="Arial" w:eastAsia="Batang" w:hAnsi="Arial" w:cs="Arial"/>
+          <w:sz w:val="14"/>
+          <w:szCs w:val="14"/>
+        </w:rPr>
+        <w:t>hipoteca en primer</w:t>
+      </w:r>
+      <w:r>
+        <w:rPr>
+          <w:rFonts w:ascii="Arial" w:eastAsia="Batang" w:hAnsi="Arial" w:cs="Arial"/>
+          <w:sz w:val="14"/>
+          <w:szCs w:val="14"/>
+        </w:rPr>
+        <w:t xml:space="preserve"> lugar y </w:t>
+      </w:r>
+      <w:r>
+        <w:rPr>
+          <w:rFonts w:ascii="Arial" w:eastAsia="Batang" w:hAnsi="Arial" w:cs="Arial"/>
+          <w:sz w:val="14"/>
+          <w:szCs w:val="14"/>
+        </w:rPr>
+        <w:t xml:space="preserve">grado, </w:t>
+      </w:r>
+      <w:r>
+        <w:rPr>
+          <w:rFonts w:ascii="Arial" w:eastAsia="Batang" w:hAnsi="Arial" w:cs="Arial"/>
+          <w:sz w:val="14"/>
+          <w:szCs w:val="14"/>
+        </w:rPr>
+        <w:t>a</w:t>
+      </w:r>
+      <w:r>
+        <w:rPr>
+          <w:rFonts w:ascii="Arial" w:eastAsia="Batang" w:hAnsi="Arial" w:cs="Arial"/>
+          <w:sz w:val="14"/>
+          <w:szCs w:val="14"/>
+        </w:rPr>
+        <w:t xml:space="preserve"> favor del </w:t>
+      </w:r>
+      <w:r>
+        <w:rPr>
+          <w:rFonts w:ascii="Arial" w:eastAsia="Batang" w:hAnsi="Arial" w:cs="Arial"/>
+          <w:b/>
+          <w:sz w:val="14"/>
+          <w:szCs w:val="14"/>
+        </w:rPr>
+        <w:t>INSTITUTO DEL FONDO NACIONAL DE LA VIVIENDA PARA LOS TRABAJADORES</w:t>
+      </w:r>
+      <w:r>
+        <w:rPr>
+          <w:rFonts w:ascii="Arial" w:eastAsia="Batang" w:hAnsi="Arial" w:cs="Arial"/>
+          <w:bCs/>
+          <w:sz w:val="14"/>
+          <w:szCs w:val="14"/>
+        </w:rPr>
+        <w:t>,</w:t>
+      </w:r>
+      <w:r>
+        <w:rPr>
+          <w:rFonts w:ascii="Arial" w:eastAsia="Batang" w:hAnsi="Arial" w:cs="Arial"/>
+          <w:sz w:val="14"/>
+          <w:szCs w:val="14"/>
+        </w:rPr>
+        <w:t xml:space="preserve"> </w:t>
+      </w:r>
+      <w:r>
+        <w:rPr>
+          <w:rFonts w:ascii="Arial" w:eastAsia="Batang" w:hAnsi="Arial" w:cs="Arial"/>
+          <w:sz w:val="14"/>
+          <w:szCs w:val="14"/>
+        </w:rPr>
+        <w:t>sobre</w:t>
+      </w:r>
+      <w:r>
+        <w:rPr>
+          <w:rFonts w:ascii="Arial" w:eastAsia="Batang" w:hAnsi="Arial" w:cs="Arial"/>
+          <w:sz w:val="14"/>
+          <w:szCs w:val="14"/>
+        </w:rPr>
+        <w:t xml:space="preserve"> </w:t>
+      </w:r>
+      <w:r>
+        <w:rPr>
+          <w:rFonts w:ascii="Arial" w:eastAsia="Batang" w:hAnsi="Arial" w:cs="Arial"/>
+          <w:b/>
+          <w:bCs/>
+          <w:sz w:val="14"/>
+          <w:szCs w:val="14"/>
+        </w:rPr>
+        <w:t>{{ datos_inmueble }}</w:t>
+      </w:r>
+      <w:r>
+        <w:rPr>
+          <w:rFonts w:ascii="Arial" w:eastAsia="Batang" w:hAnsi="Arial" w:cs="Arial"/>
+          <w:b/>
+          <w:bCs/>
+          <w:sz w:val="14"/>
+          <w:szCs w:val="14"/>
+        </w:rPr>
+        <w:t>,</w:t>
+      </w:r>
+      <w:r>
+        <w:rPr>
+          <w:rFonts w:ascii="Arial" w:eastAsia="Batang" w:hAnsi="Arial" w:cs="Arial"/>
+          <w:sz w:val="14"/>
+          <w:szCs w:val="14"/>
+        </w:rPr>
+        <w:t xml:space="preserve"> con la superficie, medidas</w:t>
+      </w:r>
+      <w:r>
+        <w:rPr>
+          <w:rFonts w:ascii="Arial" w:eastAsia="Batang" w:hAnsi="Arial" w:cs="Arial"/>
+          <w:sz w:val="14"/>
+          <w:szCs w:val="14"/>
+        </w:rPr>
+        <w:t>,</w:t>
+      </w:r>
+      <w:r>
+        <w:rPr>
+          <w:rFonts w:ascii="Arial" w:eastAsia="Batang" w:hAnsi="Arial" w:cs="Arial"/>
+          <w:sz w:val="14"/>
+          <w:szCs w:val="14"/>
+        </w:rPr>
+        <w:t xml:space="preserve"> colindancias</w:t>
+      </w:r>
+      <w:r>
+        <w:rPr>
+          <w:rFonts w:ascii="Arial" w:eastAsia="Batang" w:hAnsi="Arial" w:cs="Arial"/>
+          <w:sz w:val="14"/>
+          <w:szCs w:val="14"/>
+        </w:rPr>
+        <w:t xml:space="preserve"> e</w:t>
+      </w:r>
+      <w:r>
+        <w:rPr>
+          <w:rFonts w:ascii="Arial" w:eastAsia="Batang" w:hAnsi="Arial" w:cs="Arial"/>
+          <w:sz w:val="14"/>
+          <w:szCs w:val="14"/>
+        </w:rPr>
+        <w:t xml:space="preserve"> </w:t>
+      </w:r>
+      <w:r>
+        <w:rPr>
+          <w:rFonts w:ascii="Arial" w:eastAsia="Batang" w:hAnsi="Arial" w:cs="Arial"/>
+          <w:sz w:val="14"/>
+          <w:szCs w:val="14"/>
+        </w:rPr>
+        <w:t>indiviso,</w:t>
+      </w:r>
+      <w:r>
+        <w:rPr>
+          <w:rFonts w:ascii="Arial" w:eastAsia="Batang" w:hAnsi="Arial" w:cs="Arial"/>
+          <w:sz w:val="14"/>
+          <w:szCs w:val="14"/>
+        </w:rPr>
+        <w:t xml:space="preserve"> </w:t>
+      </w:r>
+      <w:r>
+        <w:rPr>
+          <w:rFonts w:ascii="Arial" w:eastAsia="Batang" w:hAnsi="Arial" w:cs="Arial"/>
+          <w:sz w:val="14"/>
+          <w:szCs w:val="14"/>
+        </w:rPr>
+        <w:t>que quedaron descritos en el instrumento que se relaciona, mismos datos que se tienen aquí por reproducidos como si a la letra se insertasen</w:t>
+      </w:r>
+      <w:r>
+        <w:rPr>
+          <w:rFonts w:ascii="Arial" w:eastAsia="Batang" w:hAnsi="Arial" w:cs="Arial"/>
+          <w:sz w:val="14"/>
+          <w:szCs w:val="14"/>
+        </w:rPr>
+        <w:t>.</w:t>
+      </w:r>
+      <w:r>
+        <w:rPr>
+          <w:rFonts w:ascii="Arial" w:eastAsia="Batang" w:hAnsi="Arial" w:cs="Arial"/>
+          <w:sz w:val="14"/>
+          <w:szCs w:val="14"/>
+        </w:rPr>
+        <w:tab/>
       </w:r>
     </w:p>
     <w:p>
       <w:pPr>
-        <w:pStyle w:val="Sinespaciado"/>
         <w:tabs>
           <w:tab w:val="left" w:leader="hyphen" w:pos="709"/>
           <w:tab w:val="right" w:leader="hyphen" w:pos="9072"/>
@@ -1869,90 +2241,205 @@
         <w:jc w:val="both"/>
         <w:rPr>
           <w:rFonts w:ascii="Arial" w:eastAsia="Batang" w:hAnsi="Arial" w:cs="Arial"/>
-          <w:sz w:val="14"/>
-          <w:szCs w:val="14"/>
-        </w:rPr>
-      </w:pPr>
-      <w:r>
-        <w:rPr>
-          <w:rFonts w:ascii="Arial" w:eastAsia="Batang" w:hAnsi="Arial" w:cs="Arial"/>
-          <w:b/>
-          <w:bCs/>
-          <w:iCs/>
+          <w:b/>
+          <w:bCs/>
           <w:sz w:val="14"/>
           <w:szCs w:val="14"/>
           <w:lang w:val="es-MX"/>
         </w:rPr>
-        <w:t>MONEDA NACIONAL)</w:t>
-      </w:r>
-      <w:r>
-        <w:rPr>
-          <w:rFonts w:ascii="Arial" w:eastAsia="Batang" w:hAnsi="Arial" w:cs="Arial"/>
-          <w:b/>
-          <w:bCs/>
-          <w:iCs/>
+      </w:pPr>
+      <w:r>
+        <w:rPr>
+          <w:rFonts w:ascii="Arial" w:eastAsia="Batang" w:hAnsi="Arial" w:cs="Arial"/>
+          <w:b/>
           <w:sz w:val="14"/>
           <w:szCs w:val="14"/>
           <w:lang w:val="es-MX"/>
         </w:rPr>
-        <w:t>,</w:t>
-      </w:r>
-      <w:r>
-        <w:rPr>
-          <w:rFonts w:ascii="Arial" w:eastAsia="Batang" w:hAnsi="Arial" w:cs="Arial"/>
-          <w:b/>
-          <w:bCs/>
-          <w:iCs/>
+        <w:t xml:space="preserve">-------- DATOS DE </w:t>
+      </w:r>
+      <w:proofErr w:type="gramStart"/>
+      <w:r>
+        <w:rPr>
+          <w:rFonts w:ascii="Arial" w:eastAsia="Batang" w:hAnsi="Arial" w:cs="Arial"/>
+          <w:b/>
           <w:sz w:val="14"/>
           <w:szCs w:val="14"/>
           <w:lang w:val="es-MX"/>
         </w:rPr>
+        <w:t>REGISTRO</w:t>
+      </w:r>
+      <w:r>
+        <w:rPr>
+          <w:rFonts w:ascii="Arial" w:eastAsia="Batang" w:hAnsi="Arial" w:cs="Arial"/>
+          <w:sz w:val="14"/>
+          <w:szCs w:val="14"/>
+          <w:lang w:val="es-MX"/>
+        </w:rPr>
+        <w:t>.-</w:t>
+      </w:r>
+      <w:proofErr w:type="gramEnd"/>
+      <w:r>
+        <w:rPr>
+          <w:rFonts w:ascii="Arial" w:eastAsia="Batang" w:hAnsi="Arial" w:cs="Arial"/>
+          <w:sz w:val="14"/>
+          <w:szCs w:val="14"/>
+          <w:lang w:val="es-MX"/>
+        </w:rPr>
+        <w:t xml:space="preserve"> El instrumento antes relacionado se encuentra inscrito en el Registro Público de la Propiedad y de Comercio de la Ciudad de México, en el Folio Real número</w:t>
+      </w:r>
+      <w:r>
+        <w:rPr>
+          <w:rFonts w:ascii="Arial" w:eastAsia="Batang" w:hAnsi="Arial" w:cs="Arial"/>
+          <w:sz w:val="14"/>
+          <w:szCs w:val="14"/>
+          <w:lang w:val="es-MX"/>
+        </w:rPr>
         <w:t xml:space="preserve"> </w:t>
       </w:r>
-      <w:r>
-        <w:rPr>
-          <w:rFonts w:ascii="Arial" w:eastAsia="Batang" w:hAnsi="Arial" w:cs="Arial"/>
-          <w:sz w:val="14"/>
-          <w:szCs w:val="14"/>
-        </w:rPr>
-        <w:t xml:space="preserve">con los intereses y demás </w:t>
-      </w:r>
-      <w:r>
-        <w:rPr>
-          <w:rFonts w:ascii="Arial" w:eastAsia="Batang" w:hAnsi="Arial" w:cs="Arial"/>
-          <w:sz w:val="14"/>
-          <w:szCs w:val="14"/>
-        </w:rPr>
-        <w:t xml:space="preserve">accesorios legales </w:t>
-      </w:r>
-      <w:r>
-        <w:rPr>
-          <w:rFonts w:ascii="Arial" w:eastAsia="Batang" w:hAnsi="Arial" w:cs="Arial"/>
-          <w:sz w:val="14"/>
-          <w:szCs w:val="14"/>
-        </w:rPr>
-        <w:t>ahí precisado</w:t>
-      </w:r>
-      <w:r>
-        <w:rPr>
-          <w:rFonts w:ascii="Arial" w:eastAsia="Batang" w:hAnsi="Arial" w:cs="Arial"/>
-          <w:sz w:val="14"/>
-          <w:szCs w:val="14"/>
-        </w:rPr>
-        <w:t>s.</w:t>
-      </w:r>
-      <w:r>
-        <w:rPr>
-          <w:rFonts w:ascii="Arial" w:eastAsia="Batang" w:hAnsi="Arial" w:cs="Arial"/>
-          <w:sz w:val="14"/>
-          <w:szCs w:val="14"/>
+      <w:proofErr w:type="gramStart"/>
+      <w:r>
+        <w:rPr>
+          <w:rFonts w:ascii="Arial" w:eastAsia="Batang" w:hAnsi="Arial" w:cs="Arial"/>
+          <w:b/>
+          <w:bCs/>
+          <w:sz w:val="14"/>
+          <w:szCs w:val="14"/>
+          <w:lang w:val="es-MX"/>
+        </w:rPr>
+        <w:t>{{ folio</w:t>
+      </w:r>
+      <w:proofErr w:type="gramEnd"/>
+      <w:r>
+        <w:rPr>
+          <w:rFonts w:ascii="Arial" w:eastAsia="Batang" w:hAnsi="Arial" w:cs="Arial"/>
+          <w:b/>
+          <w:bCs/>
+          <w:sz w:val="14"/>
+          <w:szCs w:val="14"/>
+          <w:lang w:val="es-MX"/>
+        </w:rPr>
+        <w:t>_</w:t>
+      </w:r>
+      <w:proofErr w:type="gramStart"/>
+      <w:r>
+        <w:rPr>
+          <w:rFonts w:ascii="Arial" w:eastAsia="Batang" w:hAnsi="Arial" w:cs="Arial"/>
+          <w:b/>
+          <w:bCs/>
+          <w:sz w:val="14"/>
+          <w:szCs w:val="14"/>
+          <w:lang w:val="es-MX"/>
+        </w:rPr>
+        <w:t>real }</w:t>
+      </w:r>
+      <w:proofErr w:type="gramEnd"/>
+      <w:r>
+        <w:rPr>
+          <w:rFonts w:ascii="Arial" w:eastAsia="Batang" w:hAnsi="Arial" w:cs="Arial"/>
+          <w:b/>
+          <w:bCs/>
+          <w:sz w:val="14"/>
+          <w:szCs w:val="14"/>
+          <w:lang w:val="es-MX"/>
+        </w:rPr>
+        <w:t>}</w:t>
+      </w:r>
+      <w:r>
+        <w:rPr>
+          <w:rFonts w:ascii="Arial" w:eastAsia="Batang" w:hAnsi="Arial" w:cs="Arial"/>
+          <w:b/>
+          <w:bCs/>
+          <w:sz w:val="14"/>
+          <w:szCs w:val="14"/>
+          <w:lang w:val="es-MX"/>
+        </w:rPr>
+        <w:t xml:space="preserve">, Auxiliar </w:t>
+      </w:r>
+      <w:proofErr w:type="gramStart"/>
+      <w:r>
+        <w:rPr>
+          <w:rFonts w:ascii="Arial" w:eastAsia="Batang" w:hAnsi="Arial" w:cs="Arial"/>
+          <w:b/>
+          <w:bCs/>
+          <w:sz w:val="14"/>
+          <w:szCs w:val="14"/>
+          <w:lang w:val="es-MX"/>
+        </w:rPr>
+        <w:t>“    ”</w:t>
+      </w:r>
+      <w:proofErr w:type="gramEnd"/>
+      <w:r>
+        <w:rPr>
+          <w:rFonts w:ascii="Arial" w:eastAsia="Batang" w:hAnsi="Arial" w:cs="Arial"/>
+          <w:b/>
+          <w:bCs/>
+          <w:sz w:val="14"/>
+          <w:szCs w:val="14"/>
+          <w:lang w:val="es-MX"/>
+        </w:rPr>
+        <w:t xml:space="preserve"> </w:t>
+      </w:r>
+      <w:proofErr w:type="gramStart"/>
+      <w:r>
+        <w:rPr>
+          <w:rFonts w:ascii="Arial" w:eastAsia="Batang" w:hAnsi="Arial" w:cs="Arial"/>
+          <w:b/>
+          <w:bCs/>
+          <w:sz w:val="14"/>
+          <w:szCs w:val="14"/>
+          <w:lang w:val="es-MX"/>
+        </w:rPr>
+        <w:t xml:space="preserve">(  </w:t>
+      </w:r>
+      <w:proofErr w:type="gramEnd"/>
+      <w:r>
+        <w:rPr>
+          <w:rFonts w:ascii="Arial" w:eastAsia="Batang" w:hAnsi="Arial" w:cs="Arial"/>
+          <w:b/>
+          <w:bCs/>
+          <w:sz w:val="14"/>
+          <w:szCs w:val="14"/>
+          <w:lang w:val="es-MX"/>
+        </w:rPr>
+        <w:t xml:space="preserve">   </w:t>
+      </w:r>
+      <w:proofErr w:type="gramStart"/>
+      <w:r>
+        <w:rPr>
+          <w:rFonts w:ascii="Arial" w:eastAsia="Batang" w:hAnsi="Arial" w:cs="Arial"/>
+          <w:b/>
+          <w:bCs/>
+          <w:sz w:val="14"/>
+          <w:szCs w:val="14"/>
+          <w:lang w:val="es-MX"/>
+        </w:rPr>
+        <w:t xml:space="preserve">  )</w:t>
+      </w:r>
+      <w:proofErr w:type="gramEnd"/>
+      <w:r>
+        <w:rPr>
+          <w:rFonts w:ascii="Arial" w:eastAsia="Batang" w:hAnsi="Arial" w:cs="Arial"/>
+          <w:b/>
+          <w:bCs/>
+          <w:sz w:val="14"/>
+          <w:szCs w:val="14"/>
+          <w:lang w:val="es-MX"/>
+        </w:rPr>
+        <w:t>.</w:t>
+      </w:r>
+      <w:r>
+        <w:rPr>
+          <w:rFonts w:ascii="Arial" w:eastAsia="Batang" w:hAnsi="Arial" w:cs="Arial"/>
+          <w:sz w:val="14"/>
+          <w:szCs w:val="14"/>
+          <w:lang w:val="es-MX"/>
         </w:rPr>
         <w:tab/>
       </w:r>
     </w:p>
     <w:p>
       <w:pPr>
-        <w:pStyle w:val="Sinespaciado"/>
         <w:tabs>
           <w:tab w:val="left" w:leader="hyphen" w:pos="709"/>
           <w:tab w:val="right" w:leader="hyphen" w:pos="9072"/>
@@ -1961,85 +2448,130 @@
         <w:spacing w:line="360" w:lineRule="auto"/>
         <w:jc w:val="both"/>
         <w:rPr>
-          <w:rFonts w:ascii="Arial" w:eastAsia="Batang" w:hAnsi="Arial" w:cs="Arial"/>
-          <w:sz w:val="14"/>
-          <w:szCs w:val="14"/>
-        </w:rPr>
-      </w:pPr>
-      <w:r>
-        <w:rPr>
-          <w:rFonts w:ascii="Arial" w:eastAsia="Batang" w:hAnsi="Arial" w:cs="Arial"/>
-          <w:sz w:val="14"/>
-          <w:szCs w:val="14"/>
+          <w:rFonts w:ascii="Arial" w:hAnsi="Arial" w:cs="Arial"/>
+          <w:sz w:val="14"/>
+          <w:szCs w:val="14"/>
+        </w:rPr>
+      </w:pPr>
+      <w:r>
+        <w:rPr>
+          <w:rFonts w:ascii="Arial" w:hAnsi="Arial" w:cs="Arial"/>
+          <w:sz w:val="14"/>
+          <w:szCs w:val="14"/>
+          <w:lang w:val="es-ES"/>
         </w:rPr>
         <w:t>---</w:t>
       </w:r>
       <w:r>
         <w:rPr>
-          <w:rFonts w:ascii="Arial" w:eastAsia="Batang" w:hAnsi="Arial" w:cs="Arial"/>
-          <w:sz w:val="14"/>
-          <w:szCs w:val="14"/>
+          <w:rFonts w:ascii="Arial" w:hAnsi="Arial" w:cs="Arial"/>
+          <w:sz w:val="14"/>
+          <w:szCs w:val="14"/>
+          <w:lang w:val="es-ES"/>
         </w:rPr>
         <w:t xml:space="preserve">----- </w:t>
       </w:r>
       <w:r>
         <w:rPr>
-          <w:rFonts w:ascii="Arial" w:eastAsia="Batang" w:hAnsi="Arial" w:cs="Arial"/>
-          <w:sz w:val="14"/>
-          <w:szCs w:val="14"/>
-        </w:rPr>
-        <w:t>P</w:t>
-      </w:r>
-      <w:r>
-        <w:rPr>
-          <w:rFonts w:ascii="Arial" w:eastAsia="Batang" w:hAnsi="Arial" w:cs="Arial"/>
-          <w:sz w:val="14"/>
-          <w:szCs w:val="14"/>
-        </w:rPr>
-        <w:t xml:space="preserve">ara garantizar el puntual y preferente pago del adeudo, </w:t>
-      </w:r>
-      <w:r>
-        <w:rPr>
-          <w:rFonts w:ascii="Arial" w:hAnsi="Arial" w:cs="Arial"/>
-          <w:bCs/>
-          <w:sz w:val="14"/>
-          <w:szCs w:val="14"/>
-        </w:rPr>
-        <w:t>“</w:t>
-      </w:r>
-      <w:r>
-        <w:rPr>
-          <w:rFonts w:ascii="Arial" w:hAnsi="Arial" w:cs="Arial"/>
-          <w:b/>
-          <w:sz w:val="14"/>
-          <w:szCs w:val="14"/>
-        </w:rPr>
-        <w:t>EL ACREDITADO</w:t>
-      </w:r>
-      <w:r>
-        <w:rPr>
-          <w:rFonts w:ascii="Arial" w:hAnsi="Arial" w:cs="Arial"/>
-          <w:bCs/>
-          <w:sz w:val="14"/>
-          <w:szCs w:val="14"/>
-        </w:rPr>
-        <w:t>”</w:t>
-      </w:r>
-      <w:r>
-        <w:rPr>
-          <w:rFonts w:ascii="Arial" w:hAnsi="Arial" w:cs="Arial"/>
-          <w:b/>
-          <w:bCs/>
-          <w:sz w:val="14"/>
-          <w:szCs w:val="14"/>
-          <w:lang w:val="es-ES"/>
+          <w:rFonts w:ascii="Arial" w:hAnsi="Arial" w:cs="Arial"/>
+          <w:b/>
+          <w:sz w:val="14"/>
+          <w:szCs w:val="14"/>
+        </w:rPr>
+        <w:t xml:space="preserve">II.- CARTA DE INSTRUCCIÓN DE CANCELACIÓN DE HIPOTECA.- </w:t>
+      </w:r>
+      <w:r>
+        <w:rPr>
+          <w:rFonts w:ascii="Arial" w:hAnsi="Arial" w:cs="Arial"/>
+          <w:sz w:val="14"/>
+          <w:szCs w:val="14"/>
+        </w:rPr>
+        <w:t>Con fecha</w:t>
+      </w:r>
+      <w:r>
+        <w:rPr>
+          <w:rFonts w:ascii="Arial" w:hAnsi="Arial" w:cs="Arial"/>
+          <w:sz w:val="14"/>
+          <w:szCs w:val="14"/>
+        </w:rPr>
+        <w:t xml:space="preserve"> </w:t>
+      </w:r>
+      <w:r>
+        <w:rPr>
+          <w:rFonts w:ascii="Arial" w:hAnsi="Arial" w:cs="Arial"/>
+          <w:sz w:val="14"/>
+          <w:szCs w:val="14"/>
+        </w:rPr>
+        <w:t>{{ fecha_expedicion }}</w:t>
+      </w:r>
+      <w:r>
+        <w:rPr>
+          <w:rFonts w:ascii="Arial" w:hAnsi="Arial" w:cs="Arial"/>
+          <w:sz w:val="14"/>
+          <w:szCs w:val="14"/>
+        </w:rPr>
+        <w:t xml:space="preserve">, el </w:t>
+      </w:r>
+      <w:r>
+        <w:rPr>
+          <w:rFonts w:ascii="Arial" w:hAnsi="Arial" w:cs="Arial"/>
+          <w:b/>
+          <w:sz w:val="14"/>
+          <w:szCs w:val="14"/>
+        </w:rPr>
+        <w:t xml:space="preserve">INSTITUTO DEL FONDO NACIONAL DE LA VIVIENDA PARA LOS TRABAJADORES, </w:t>
+      </w:r>
+      <w:r>
+        <w:rPr>
+          <w:rFonts w:ascii="Arial" w:hAnsi="Arial" w:cs="Arial"/>
+          <w:sz w:val="14"/>
+          <w:szCs w:val="14"/>
+        </w:rPr>
+        <w:t>giró carta</w:t>
+      </w:r>
+      <w:r>
+        <w:rPr>
+          <w:rFonts w:ascii="Arial" w:hAnsi="Arial" w:cs="Arial"/>
+          <w:sz w:val="14"/>
+          <w:szCs w:val="14"/>
+        </w:rPr>
+        <w:t xml:space="preserve"> de instrucción de cancelación de hipoteca con</w:t>
+      </w:r>
+      <w:r>
+        <w:rPr>
+          <w:rFonts w:ascii="Arial" w:hAnsi="Arial" w:cs="Arial"/>
+          <w:sz w:val="14"/>
+          <w:szCs w:val="14"/>
+        </w:rPr>
+        <w:t xml:space="preserve"> número</w:t>
+      </w:r>
+      <w:r>
+        <w:rPr>
+          <w:rFonts w:ascii="Arial" w:hAnsi="Arial" w:cs="Arial"/>
+          <w:sz w:val="14"/>
+          <w:szCs w:val="14"/>
+        </w:rPr>
+        <w:t xml:space="preserve"> </w:t>
+      </w:r>
+      <w:r>
+        <w:rPr>
+          <w:rFonts w:ascii="Arial" w:hAnsi="Arial" w:cs="Arial"/>
+          <w:sz w:val="14"/>
+          <w:szCs w:val="14"/>
+        </w:rPr>
+        <w:t>{{ numero_carta }}</w:t>
+      </w:r>
+      <w:r>
+        <w:rPr>
+          <w:rFonts w:ascii="Arial" w:hAnsi="Arial" w:cs="Arial"/>
+          <w:sz w:val="14"/>
+          <w:szCs w:val="14"/>
         </w:rPr>
         <w:t>,</w:t>
       </w:r>
       <w:r>
         <w:rPr>
-          <w:rFonts w:ascii="Arial" w:eastAsia="Batang" w:hAnsi="Arial" w:cs="Arial"/>
-          <w:bCs/>
+          <w:rFonts w:ascii="Arial" w:hAnsi="Arial" w:cs="Arial"/>
           <w:sz w:val="14"/>
           <w:szCs w:val="14"/>
         </w:rPr>
@@ -2047,26 +2579,93 @@
       </w:r>
       <w:r>
         <w:rPr>
-          <w:rFonts w:ascii="Arial" w:eastAsia="Batang" w:hAnsi="Arial" w:cs="Arial"/>
-          <w:bCs/>
-          <w:sz w:val="14"/>
-          <w:szCs w:val="14"/>
-        </w:rPr>
-        <w:t xml:space="preserve">con el consentimiento de su cónyuge la señora </w:t>
-      </w:r>
-      <w:r>
-        <w:rPr>
-          <w:rFonts w:ascii="Arial" w:eastAsia="Batang" w:hAnsi="Arial" w:cs="Arial"/>
-          <w:bCs/>
-          <w:sz w:val="14"/>
-          <w:szCs w:val="14"/>
-        </w:rPr>
-        <w:t>***</w:t>
-      </w:r>
-      <w:r>
-        <w:rPr>
-          <w:rFonts w:ascii="Arial" w:eastAsia="Batang" w:hAnsi="Arial" w:cs="Arial"/>
-          <w:bCs/>
+          <w:rFonts w:ascii="Arial" w:hAnsi="Arial" w:cs="Arial"/>
+          <w:sz w:val="14"/>
+          <w:szCs w:val="14"/>
+        </w:rPr>
+        <w:t xml:space="preserve">al suscrito Notario para la realización del </w:t>
+      </w:r>
+      <w:r>
+        <w:rPr>
+          <w:rFonts w:ascii="Arial" w:hAnsi="Arial" w:cs="Arial"/>
+          <w:sz w:val="14"/>
+          <w:szCs w:val="14"/>
+        </w:rPr>
+        <w:t xml:space="preserve">presente </w:t>
+      </w:r>
+      <w:r>
+        <w:rPr>
+          <w:rFonts w:ascii="Arial" w:hAnsi="Arial" w:cs="Arial"/>
+          <w:sz w:val="14"/>
+          <w:szCs w:val="14"/>
+        </w:rPr>
+        <w:t xml:space="preserve">instrumento </w:t>
+      </w:r>
+      <w:r>
+        <w:rPr>
+          <w:rFonts w:ascii="Arial" w:hAnsi="Arial" w:cs="Arial"/>
+          <w:sz w:val="14"/>
+          <w:szCs w:val="14"/>
+        </w:rPr>
+        <w:t>en donde se men</w:t>
+      </w:r>
+      <w:r>
+        <w:rPr>
+          <w:rFonts w:ascii="Arial" w:hAnsi="Arial" w:cs="Arial"/>
+          <w:sz w:val="14"/>
+          <w:szCs w:val="14"/>
+        </w:rPr>
+        <w:t>ciona que el crédito relacionado</w:t>
+      </w:r>
+      <w:r>
+        <w:rPr>
+          <w:rFonts w:ascii="Arial" w:hAnsi="Arial" w:cs="Arial"/>
+          <w:bCs/>
+          <w:sz w:val="14"/>
+          <w:szCs w:val="14"/>
+        </w:rPr>
+        <w:t xml:space="preserve"> </w:t>
+      </w:r>
+      <w:r>
+        <w:rPr>
+          <w:rFonts w:ascii="Arial" w:hAnsi="Arial" w:cs="Arial"/>
+          <w:bCs/>
+          <w:sz w:val="14"/>
+          <w:szCs w:val="14"/>
+        </w:rPr>
+        <w:t xml:space="preserve">en </w:t>
+      </w:r>
+      <w:r>
+        <w:rPr>
+          <w:rFonts w:ascii="Arial" w:hAnsi="Arial" w:cs="Arial"/>
+          <w:bCs/>
+          <w:sz w:val="14"/>
+          <w:szCs w:val="14"/>
+        </w:rPr>
+        <w:t>el antecedente uno romano</w:t>
+      </w:r>
+      <w:r>
+        <w:rPr>
+          <w:rFonts w:ascii="Arial" w:hAnsi="Arial" w:cs="Arial"/>
+          <w:b/>
+          <w:bCs/>
+          <w:sz w:val="14"/>
+          <w:szCs w:val="14"/>
+        </w:rPr>
+        <w:t xml:space="preserve"> </w:t>
+      </w:r>
+      <w:r>
+        <w:rPr>
+          <w:rFonts w:ascii="Arial" w:hAnsi="Arial" w:cs="Arial"/>
+          <w:bCs/>
+          <w:sz w:val="14"/>
+          <w:szCs w:val="14"/>
+        </w:rPr>
+        <w:t>de este instrumento</w:t>
+      </w:r>
+      <w:r>
+        <w:rPr>
+          <w:rFonts w:ascii="Arial" w:hAnsi="Arial" w:cs="Arial"/>
           <w:sz w:val="14"/>
           <w:szCs w:val="14"/>
         </w:rPr>
@@ -2074,23 +2673,55 @@
       </w:r>
       <w:r>
         <w:rPr>
-          <w:rFonts w:ascii="Arial" w:eastAsia="Batang" w:hAnsi="Arial" w:cs="Arial"/>
-          <w:sz w:val="14"/>
-          <w:szCs w:val="14"/>
-        </w:rPr>
-        <w:t>constituy</w:t>
-      </w:r>
-      <w:r>
-        <w:rPr>
-          <w:rFonts w:ascii="Arial" w:eastAsia="Batang" w:hAnsi="Arial" w:cs="Arial"/>
-          <w:sz w:val="14"/>
-          <w:szCs w:val="14"/>
-        </w:rPr>
-        <w:t>ó</w:t>
-      </w:r>
-      <w:r>
-        <w:rPr>
-          <w:rFonts w:ascii="Arial" w:eastAsia="Batang" w:hAnsi="Arial" w:cs="Arial"/>
+          <w:rFonts w:ascii="Arial" w:hAnsi="Arial" w:cs="Arial"/>
+          <w:sz w:val="14"/>
+          <w:szCs w:val="14"/>
+        </w:rPr>
+        <w:t xml:space="preserve">no presenta saldo </w:t>
+      </w:r>
+      <w:r>
+        <w:rPr>
+          <w:rFonts w:ascii="Arial" w:hAnsi="Arial" w:cs="Arial"/>
+          <w:sz w:val="14"/>
+          <w:szCs w:val="14"/>
+        </w:rPr>
+        <w:t>deudor</w:t>
+      </w:r>
+      <w:r>
+        <w:rPr>
+          <w:rFonts w:ascii="Arial" w:hAnsi="Arial" w:cs="Arial"/>
+          <w:sz w:val="14"/>
+          <w:szCs w:val="14"/>
+        </w:rPr>
+        <w:t xml:space="preserve"> ante </w:t>
+      </w:r>
+      <w:r>
+        <w:rPr>
+          <w:rFonts w:ascii="Arial" w:hAnsi="Arial" w:cs="Arial"/>
+          <w:sz w:val="14"/>
+          <w:szCs w:val="14"/>
+        </w:rPr>
+        <w:t>dicho</w:t>
+      </w:r>
+      <w:r>
+        <w:rPr>
+          <w:rFonts w:ascii="Arial" w:hAnsi="Arial" w:cs="Arial"/>
+          <w:sz w:val="14"/>
+          <w:szCs w:val="14"/>
+        </w:rPr>
+        <w:t xml:space="preserve"> instituto </w:t>
+      </w:r>
+      <w:r>
+        <w:rPr>
+          <w:rFonts w:ascii="Arial" w:hAnsi="Arial" w:cs="Arial"/>
+          <w:sz w:val="14"/>
+          <w:szCs w:val="14"/>
+        </w:rPr>
+        <w:t>a partir del día</w:t>
+      </w:r>
+      <w:r>
+        <w:rPr>
+          <w:rFonts w:ascii="Arial" w:hAnsi="Arial" w:cs="Arial"/>
           <w:sz w:val="14"/>
           <w:szCs w:val="14"/>
         </w:rPr>
@@ -2098,645 +2729,11 @@
       </w:r>
       <w:r>
         <w:rPr>
-          <w:rFonts w:ascii="Arial" w:eastAsia="Batang" w:hAnsi="Arial" w:cs="Arial"/>
-          <w:sz w:val="14"/>
-          <w:szCs w:val="14"/>
-        </w:rPr>
-        <w:t>hipoteca en primer</w:t>
-      </w:r>
-      <w:r>
-        <w:rPr>
-          <w:rFonts w:ascii="Arial" w:eastAsia="Batang" w:hAnsi="Arial" w:cs="Arial"/>
-          <w:sz w:val="14"/>
-          <w:szCs w:val="14"/>
-        </w:rPr>
-        <w:t xml:space="preserve"> lugar y </w:t>
-      </w:r>
-      <w:r>
-        <w:rPr>
-          <w:rFonts w:ascii="Arial" w:eastAsia="Batang" w:hAnsi="Arial" w:cs="Arial"/>
-          <w:sz w:val="14"/>
-          <w:szCs w:val="14"/>
-        </w:rPr>
-        <w:t xml:space="preserve">grado, </w:t>
-      </w:r>
-      <w:r>
-        <w:rPr>
-          <w:rFonts w:ascii="Arial" w:eastAsia="Batang" w:hAnsi="Arial" w:cs="Arial"/>
-          <w:sz w:val="14"/>
-          <w:szCs w:val="14"/>
-        </w:rPr>
-        <w:t>a</w:t>
-      </w:r>
-      <w:r>
-        <w:rPr>
-          <w:rFonts w:ascii="Arial" w:eastAsia="Batang" w:hAnsi="Arial" w:cs="Arial"/>
-          <w:sz w:val="14"/>
-          <w:szCs w:val="14"/>
-        </w:rPr>
-        <w:t xml:space="preserve"> favor del </w:t>
-      </w:r>
-      <w:r>
-        <w:rPr>
-          <w:rFonts w:ascii="Arial" w:eastAsia="Batang" w:hAnsi="Arial" w:cs="Arial"/>
-          <w:b/>
-          <w:sz w:val="14"/>
-          <w:szCs w:val="14"/>
-        </w:rPr>
-        <w:t>INSTITUTO DEL FONDO NACIONAL DE LA VIVIENDA PARA LOS TRABAJADORES</w:t>
-      </w:r>
-      <w:r>
-        <w:rPr>
-          <w:rFonts w:ascii="Arial" w:eastAsia="Batang" w:hAnsi="Arial" w:cs="Arial"/>
-          <w:bCs/>
-          <w:sz w:val="14"/>
-          <w:szCs w:val="14"/>
-        </w:rPr>
-        <w:t>,</w:t>
-      </w:r>
-      <w:r>
-        <w:rPr>
-          <w:rFonts w:ascii="Arial" w:eastAsia="Batang" w:hAnsi="Arial" w:cs="Arial"/>
-          <w:sz w:val="14"/>
-          <w:szCs w:val="14"/>
-        </w:rPr>
-        <w:t xml:space="preserve"> </w:t>
-      </w:r>
-      <w:r>
-        <w:rPr>
-          <w:rFonts w:ascii="Arial" w:eastAsia="Batang" w:hAnsi="Arial" w:cs="Arial"/>
-          <w:sz w:val="14"/>
-          <w:szCs w:val="14"/>
-        </w:rPr>
-        <w:t>sobre</w:t>
-      </w:r>
-      <w:r>
-        <w:rPr>
-          <w:rFonts w:ascii="Arial" w:eastAsia="Batang" w:hAnsi="Arial" w:cs="Arial"/>
-          <w:sz w:val="14"/>
-          <w:szCs w:val="14"/>
-        </w:rPr>
-        <w:t xml:space="preserve"> </w:t>
-      </w:r>
-    </w:p>
-    <w:p>
-      <w:pPr>
-        <w:pStyle w:val="Sinespaciado"/>
-        <w:tabs>
-          <w:tab w:val="left" w:leader="hyphen" w:pos="709"/>
-          <w:tab w:val="right" w:leader="hyphen" w:pos="9072"/>
-          <w:tab w:val="right" w:leader="hyphen" w:pos="9129"/>
-        </w:tabs>
-        <w:spacing w:line="360" w:lineRule="auto"/>
-        <w:jc w:val="both"/>
-        <w:rPr>
-          <w:rFonts w:ascii="Arial" w:eastAsia="Batang" w:hAnsi="Arial" w:cs="Arial"/>
-          <w:sz w:val="14"/>
-          <w:szCs w:val="14"/>
-        </w:rPr>
-      </w:pPr>
-    </w:p>
-    <w:p>
-      <w:pPr>
-        <w:pStyle w:val="Sinespaciado"/>
-        <w:tabs>
-          <w:tab w:val="left" w:leader="hyphen" w:pos="709"/>
-          <w:tab w:val="right" w:leader="hyphen" w:pos="9072"/>
-          <w:tab w:val="right" w:leader="hyphen" w:pos="9129"/>
-        </w:tabs>
-        <w:spacing w:line="360" w:lineRule="auto"/>
-        <w:jc w:val="both"/>
-        <w:rPr>
-          <w:rFonts w:ascii="Arial" w:eastAsia="Batang" w:hAnsi="Arial" w:cs="Arial"/>
-          <w:sz w:val="14"/>
-          <w:szCs w:val="14"/>
-        </w:rPr>
-      </w:pPr>
-      <w:r>
-        <w:rPr>
-          <w:rFonts w:ascii="Arial" w:eastAsia="Batang" w:hAnsi="Arial" w:cs="Arial"/>
-          <w:b/>
-          <w:bCs/>
-          <w:sz w:val="14"/>
-          <w:szCs w:val="14"/>
-        </w:rPr>
-        <w:t>,</w:t>
-      </w:r>
-      <w:r>
-        <w:rPr>
-          <w:rFonts w:ascii="Arial" w:eastAsia="Batang" w:hAnsi="Arial" w:cs="Arial"/>
-          <w:sz w:val="14"/>
-          <w:szCs w:val="14"/>
-        </w:rPr>
-        <w:t xml:space="preserve"> con la superficie, medidas</w:t>
-      </w:r>
-      <w:r>
-        <w:rPr>
-          <w:rFonts w:ascii="Arial" w:eastAsia="Batang" w:hAnsi="Arial" w:cs="Arial"/>
-          <w:sz w:val="14"/>
-          <w:szCs w:val="14"/>
-        </w:rPr>
-        <w:t>,</w:t>
-      </w:r>
-      <w:r>
-        <w:rPr>
-          <w:rFonts w:ascii="Arial" w:eastAsia="Batang" w:hAnsi="Arial" w:cs="Arial"/>
-          <w:sz w:val="14"/>
-          <w:szCs w:val="14"/>
-        </w:rPr>
-        <w:t xml:space="preserve"> colindancias</w:t>
-      </w:r>
-      <w:r>
-        <w:rPr>
-          <w:rFonts w:ascii="Arial" w:eastAsia="Batang" w:hAnsi="Arial" w:cs="Arial"/>
-          <w:sz w:val="14"/>
-          <w:szCs w:val="14"/>
-        </w:rPr>
-        <w:t xml:space="preserve"> e</w:t>
-      </w:r>
-      <w:r>
-        <w:rPr>
-          <w:rFonts w:ascii="Arial" w:eastAsia="Batang" w:hAnsi="Arial" w:cs="Arial"/>
-          <w:sz w:val="14"/>
-          <w:szCs w:val="14"/>
-        </w:rPr>
-        <w:t xml:space="preserve"> </w:t>
-      </w:r>
-      <w:r>
-        <w:rPr>
-          <w:rFonts w:ascii="Arial" w:eastAsia="Batang" w:hAnsi="Arial" w:cs="Arial"/>
-          <w:sz w:val="14"/>
-          <w:szCs w:val="14"/>
-        </w:rPr>
-        <w:t>indiviso,</w:t>
-      </w:r>
-      <w:r>
-        <w:rPr>
-          <w:rFonts w:ascii="Arial" w:eastAsia="Batang" w:hAnsi="Arial" w:cs="Arial"/>
-          <w:sz w:val="14"/>
-          <w:szCs w:val="14"/>
-        </w:rPr>
-        <w:t xml:space="preserve"> </w:t>
-      </w:r>
-      <w:r>
-        <w:rPr>
-          <w:rFonts w:ascii="Arial" w:eastAsia="Batang" w:hAnsi="Arial" w:cs="Arial"/>
-          <w:sz w:val="14"/>
-          <w:szCs w:val="14"/>
-        </w:rPr>
-        <w:t>que quedaron descritos en el instrumento que se relaciona, mismos datos que se tienen aquí por reproducidos como si a la letra se insertasen</w:t>
-      </w:r>
-      <w:r>
-        <w:rPr>
-          <w:rFonts w:ascii="Arial" w:eastAsia="Batang" w:hAnsi="Arial" w:cs="Arial"/>
-          <w:sz w:val="14"/>
-          <w:szCs w:val="14"/>
-        </w:rPr>
-        <w:t>.</w:t>
-      </w:r>
-      <w:r>
-        <w:rPr>
-          <w:rFonts w:ascii="Arial" w:eastAsia="Batang" w:hAnsi="Arial" w:cs="Arial"/>
-          <w:sz w:val="14"/>
-          <w:szCs w:val="14"/>
-        </w:rPr>
-        <w:tab/>
-      </w:r>
-    </w:p>
-    <w:p>
-      <w:pPr>
-        <w:tabs>
-          <w:tab w:val="left" w:leader="hyphen" w:pos="709"/>
-          <w:tab w:val="right" w:leader="hyphen" w:pos="9072"/>
-          <w:tab w:val="right" w:leader="hyphen" w:pos="9129"/>
-        </w:tabs>
-        <w:spacing w:line="360" w:lineRule="auto"/>
-        <w:jc w:val="both"/>
-        <w:rPr>
-          <w:rFonts w:ascii="Arial" w:eastAsia="Batang" w:hAnsi="Arial" w:cs="Arial"/>
-          <w:b/>
-          <w:bCs/>
-          <w:sz w:val="14"/>
-          <w:szCs w:val="14"/>
-          <w:lang w:val="es-MX"/>
-        </w:rPr>
-      </w:pPr>
-      <w:r>
-        <w:rPr>
-          <w:rFonts w:ascii="Arial" w:eastAsia="Batang" w:hAnsi="Arial" w:cs="Arial"/>
-          <w:b/>
-          <w:sz w:val="14"/>
-          <w:szCs w:val="14"/>
-          <w:lang w:val="es-MX"/>
-        </w:rPr>
-        <w:t>-------- DATOS DE REGISTRO</w:t>
-      </w:r>
-      <w:r>
-        <w:rPr>
-          <w:rFonts w:ascii="Arial" w:eastAsia="Batang" w:hAnsi="Arial" w:cs="Arial"/>
-          <w:sz w:val="14"/>
-          <w:szCs w:val="14"/>
-          <w:lang w:val="es-MX"/>
-        </w:rPr>
-        <w:t xml:space="preserve">.- El instrumento antes relacionado se encuentra inscrito en el Registro Público de la Propiedad y de Comercio de la Ciudad de México, en el Folio Real número </w:t>
-      </w:r>
-      <w:r>
-        <w:rPr>
-          <w:rFonts w:ascii="Arial" w:eastAsia="Batang" w:hAnsi="Arial" w:cs="Arial"/>
-          <w:b/>
-          <w:bCs/>
-          <w:sz w:val="14"/>
-          <w:szCs w:val="14"/>
-          <w:lang w:val="es-MX"/>
-        </w:rPr>
-        <w:t>“                    ” (                    ), Auxiliar “    ” (       ).</w:t>
-      </w:r>
-      <w:r>
-        <w:rPr>
-          <w:rFonts w:ascii="Arial" w:eastAsia="Batang" w:hAnsi="Arial" w:cs="Arial"/>
-          <w:sz w:val="14"/>
-          <w:szCs w:val="14"/>
-          <w:lang w:val="es-MX"/>
-        </w:rPr>
-        <w:tab/>
-      </w:r>
-    </w:p>
-    <w:p>
-      <w:pPr>
-        <w:tabs>
-          <w:tab w:val="left" w:leader="hyphen" w:pos="709"/>
-          <w:tab w:val="right" w:leader="hyphen" w:pos="9072"/>
-          <w:tab w:val="right" w:leader="hyphen" w:pos="9129"/>
-        </w:tabs>
-        <w:spacing w:line="360" w:lineRule="auto"/>
-        <w:jc w:val="both"/>
-        <w:rPr>
-          <w:rFonts w:ascii="Arial" w:hAnsi="Arial" w:cs="Arial"/>
-          <w:sz w:val="14"/>
-          <w:szCs w:val="14"/>
-        </w:rPr>
-      </w:pPr>
-      <w:r>
-        <w:rPr>
-          <w:rFonts w:ascii="Arial" w:hAnsi="Arial" w:cs="Arial"/>
-          <w:sz w:val="14"/>
-          <w:szCs w:val="14"/>
-          <w:lang w:val="es-ES"/>
-        </w:rPr>
-        <w:t>---</w:t>
-      </w:r>
-      <w:r>
-        <w:rPr>
-          <w:rFonts w:ascii="Arial" w:hAnsi="Arial" w:cs="Arial"/>
-          <w:sz w:val="14"/>
-          <w:szCs w:val="14"/>
-          <w:lang w:val="es-ES"/>
-        </w:rPr>
-        <w:t xml:space="preserve">----- </w:t>
-      </w:r>
-      <w:r>
-        <w:rPr>
-          <w:rFonts w:ascii="Arial" w:hAnsi="Arial" w:cs="Arial"/>
-          <w:b/>
-          <w:sz w:val="14"/>
-          <w:szCs w:val="14"/>
-        </w:rPr>
-        <w:t xml:space="preserve">II.- CARTA DE INSTRUCCIÓN DE CANCELACIÓN DE HIPOTECA.- </w:t>
-      </w:r>
-      <w:r>
-        <w:rPr>
-          <w:rFonts w:ascii="Arial" w:hAnsi="Arial" w:cs="Arial"/>
-          <w:sz w:val="14"/>
-          <w:szCs w:val="14"/>
-        </w:rPr>
-        <w:t>Con fecha</w:t>
-      </w:r>
-      <w:r>
-        <w:rPr>
-          <w:rFonts w:ascii="Arial" w:hAnsi="Arial" w:cs="Arial"/>
-          <w:sz w:val="14"/>
-          <w:szCs w:val="14"/>
-        </w:rPr>
-        <w:t xml:space="preserve">            </w:t>
-      </w:r>
-      <w:r>
-        <w:rPr>
-          <w:rFonts w:ascii="Arial" w:hAnsi="Arial" w:cs="Arial"/>
-          <w:sz w:val="14"/>
-          <w:szCs w:val="14"/>
-        </w:rPr>
-        <w:t xml:space="preserve">, el </w:t>
-      </w:r>
-      <w:r>
-        <w:rPr>
-          <w:rFonts w:ascii="Arial" w:hAnsi="Arial" w:cs="Arial"/>
-          <w:b/>
-          <w:sz w:val="14"/>
-          <w:szCs w:val="14"/>
-        </w:rPr>
-        <w:t xml:space="preserve">INSTITUTO DEL FONDO NACIONAL DE LA VIVIENDA PARA LOS TRABAJADORES, </w:t>
-      </w:r>
-      <w:r>
-        <w:rPr>
-          <w:rFonts w:ascii="Arial" w:hAnsi="Arial" w:cs="Arial"/>
-          <w:sz w:val="14"/>
-          <w:szCs w:val="14"/>
-        </w:rPr>
-        <w:t>giró carta</w:t>
-      </w:r>
-      <w:r>
-        <w:rPr>
-          <w:rFonts w:ascii="Arial" w:hAnsi="Arial" w:cs="Arial"/>
-          <w:sz w:val="14"/>
-          <w:szCs w:val="14"/>
-        </w:rPr>
-        <w:t xml:space="preserve"> de instrucción de cancelación de hipoteca con</w:t>
-      </w:r>
-      <w:r>
-        <w:rPr>
-          <w:rFonts w:ascii="Arial" w:hAnsi="Arial" w:cs="Arial"/>
-          <w:sz w:val="14"/>
-          <w:szCs w:val="14"/>
-        </w:rPr>
-        <w:t xml:space="preserve"> número</w:t>
-      </w:r>
-      <w:r>
-        <w:rPr>
-          <w:rFonts w:ascii="Arial" w:hAnsi="Arial" w:cs="Arial"/>
-          <w:sz w:val="14"/>
-          <w:szCs w:val="14"/>
-        </w:rPr>
-        <w:t xml:space="preserve"> </w:t>
-      </w:r>
-      <w:r>
-        <w:rPr>
-          <w:rFonts w:ascii="Arial" w:hAnsi="Arial" w:cs="Arial"/>
-          <w:sz w:val="14"/>
-          <w:szCs w:val="14"/>
-        </w:rPr>
-        <w:t>“</w:t>
-      </w:r>
-      <w:r>
-        <w:rPr>
-          <w:rFonts w:ascii="Arial" w:hAnsi="Arial" w:cs="Arial"/>
-          <w:sz w:val="14"/>
-          <w:szCs w:val="14"/>
-        </w:rPr>
-        <w:t xml:space="preserve">   </w:t>
-      </w:r>
-      <w:r>
-        <w:rPr>
-          <w:rFonts w:ascii="Arial" w:hAnsi="Arial" w:cs="Arial"/>
-          <w:sz w:val="14"/>
-          <w:szCs w:val="14"/>
-        </w:rPr>
-        <w:t xml:space="preserve">    </w:t>
-      </w:r>
-      <w:r>
-        <w:rPr>
-          <w:rFonts w:ascii="Arial" w:hAnsi="Arial" w:cs="Arial"/>
-          <w:sz w:val="14"/>
-          <w:szCs w:val="14"/>
-        </w:rPr>
-        <w:t xml:space="preserve"> </w:t>
-      </w:r>
-      <w:r>
-        <w:rPr>
-          <w:rFonts w:ascii="Arial" w:hAnsi="Arial" w:cs="Arial"/>
-          <w:sz w:val="14"/>
-          <w:szCs w:val="14"/>
-        </w:rPr>
-        <w:t xml:space="preserve">    ”</w:t>
-      </w:r>
-      <w:r>
-        <w:rPr>
-          <w:rFonts w:ascii="Arial" w:hAnsi="Arial" w:cs="Arial"/>
-          <w:sz w:val="14"/>
-          <w:szCs w:val="14"/>
-        </w:rPr>
-        <w:t xml:space="preserve"> </w:t>
-      </w:r>
-      <w:r>
-        <w:rPr>
-          <w:rFonts w:ascii="Arial" w:hAnsi="Arial" w:cs="Arial"/>
-          <w:sz w:val="14"/>
-          <w:szCs w:val="14"/>
-        </w:rPr>
-        <w:t>(</w:t>
-      </w:r>
-      <w:r>
-        <w:rPr>
-          <w:rFonts w:ascii="Arial" w:hAnsi="Arial" w:cs="Arial"/>
-          <w:sz w:val="14"/>
-          <w:szCs w:val="14"/>
-        </w:rPr>
-        <w:t xml:space="preserve">   </w:t>
-      </w:r>
-      <w:r>
-        <w:rPr>
-          <w:rFonts w:ascii="Arial" w:hAnsi="Arial" w:cs="Arial"/>
-          <w:sz w:val="14"/>
-          <w:szCs w:val="14"/>
-        </w:rPr>
-        <w:t>)</w:t>
-      </w:r>
-      <w:r>
-        <w:rPr>
-          <w:rFonts w:ascii="Arial" w:hAnsi="Arial" w:cs="Arial"/>
-          <w:sz w:val="14"/>
-          <w:szCs w:val="14"/>
-        </w:rPr>
-        <w:t>,</w:t>
-      </w:r>
-      <w:r>
-        <w:rPr>
-          <w:rFonts w:ascii="Arial" w:hAnsi="Arial" w:cs="Arial"/>
-          <w:sz w:val="14"/>
-          <w:szCs w:val="14"/>
-        </w:rPr>
-        <w:t xml:space="preserve"> </w:t>
-      </w:r>
-      <w:r>
-        <w:rPr>
-          <w:rFonts w:ascii="Arial" w:hAnsi="Arial" w:cs="Arial"/>
-          <w:sz w:val="14"/>
-          <w:szCs w:val="14"/>
-        </w:rPr>
-        <w:t xml:space="preserve">al suscrito Notario para la realización del </w:t>
-      </w:r>
-      <w:r>
-        <w:rPr>
-          <w:rFonts w:ascii="Arial" w:hAnsi="Arial" w:cs="Arial"/>
-          <w:sz w:val="14"/>
-          <w:szCs w:val="14"/>
-        </w:rPr>
-        <w:t xml:space="preserve">presente </w:t>
-      </w:r>
-      <w:r>
-        <w:rPr>
-          <w:rFonts w:ascii="Arial" w:hAnsi="Arial" w:cs="Arial"/>
-          <w:sz w:val="14"/>
-          <w:szCs w:val="14"/>
-        </w:rPr>
-        <w:t xml:space="preserve">instrumento </w:t>
-      </w:r>
-      <w:r>
-        <w:rPr>
-          <w:rFonts w:ascii="Arial" w:hAnsi="Arial" w:cs="Arial"/>
-          <w:sz w:val="14"/>
-          <w:szCs w:val="14"/>
-        </w:rPr>
-        <w:t>en donde se men</w:t>
-      </w:r>
-      <w:r>
-        <w:rPr>
-          <w:rFonts w:ascii="Arial" w:hAnsi="Arial" w:cs="Arial"/>
-          <w:sz w:val="14"/>
-          <w:szCs w:val="14"/>
-        </w:rPr>
-        <w:t>ciona que el crédito relacionado</w:t>
-      </w:r>
-      <w:r>
-        <w:rPr>
-          <w:rFonts w:ascii="Arial" w:hAnsi="Arial" w:cs="Arial"/>
-          <w:bCs/>
-          <w:sz w:val="14"/>
-          <w:szCs w:val="14"/>
-        </w:rPr>
-        <w:t xml:space="preserve"> </w:t>
-      </w:r>
-      <w:r>
-        <w:rPr>
-          <w:rFonts w:ascii="Arial" w:hAnsi="Arial" w:cs="Arial"/>
-          <w:bCs/>
-          <w:sz w:val="14"/>
-          <w:szCs w:val="14"/>
-        </w:rPr>
-        <w:t xml:space="preserve">en </w:t>
-      </w:r>
-      <w:r>
-        <w:rPr>
-          <w:rFonts w:ascii="Arial" w:hAnsi="Arial" w:cs="Arial"/>
-          <w:bCs/>
-          <w:sz w:val="14"/>
-          <w:szCs w:val="14"/>
-        </w:rPr>
-        <w:t>el antecedente uno romano</w:t>
-      </w:r>
-      <w:r>
-        <w:rPr>
-          <w:rFonts w:ascii="Arial" w:hAnsi="Arial" w:cs="Arial"/>
-          <w:b/>
-          <w:bCs/>
-          <w:sz w:val="14"/>
-          <w:szCs w:val="14"/>
-        </w:rPr>
-        <w:t xml:space="preserve"> </w:t>
-      </w:r>
-      <w:r>
-        <w:rPr>
-          <w:rFonts w:ascii="Arial" w:hAnsi="Arial" w:cs="Arial"/>
-          <w:bCs/>
-          <w:sz w:val="14"/>
-          <w:szCs w:val="14"/>
-        </w:rPr>
-        <w:t>de este instrumento</w:t>
-      </w:r>
-      <w:r>
-        <w:rPr>
-          <w:rFonts w:ascii="Arial" w:hAnsi="Arial" w:cs="Arial"/>
-          <w:sz w:val="14"/>
-          <w:szCs w:val="14"/>
-        </w:rPr>
-        <w:t xml:space="preserve">, </w:t>
-      </w:r>
-      <w:r>
-        <w:rPr>
-          <w:rFonts w:ascii="Arial" w:hAnsi="Arial" w:cs="Arial"/>
-          <w:sz w:val="14"/>
-          <w:szCs w:val="14"/>
-        </w:rPr>
-        <w:t xml:space="preserve">no presenta saldo </w:t>
-      </w:r>
-      <w:r>
-        <w:rPr>
-          <w:rFonts w:ascii="Arial" w:hAnsi="Arial" w:cs="Arial"/>
-          <w:sz w:val="14"/>
-          <w:szCs w:val="14"/>
-        </w:rPr>
-        <w:t>deudor</w:t>
-      </w:r>
-      <w:r>
-        <w:rPr>
-          <w:rFonts w:ascii="Arial" w:hAnsi="Arial" w:cs="Arial"/>
-          <w:sz w:val="14"/>
-          <w:szCs w:val="14"/>
-        </w:rPr>
-        <w:t xml:space="preserve"> ante </w:t>
-      </w:r>
-      <w:r>
-        <w:rPr>
-          <w:rFonts w:ascii="Arial" w:hAnsi="Arial" w:cs="Arial"/>
-          <w:sz w:val="14"/>
-          <w:szCs w:val="14"/>
-        </w:rPr>
-        <w:t>dicho</w:t>
-      </w:r>
-      <w:r>
-        <w:rPr>
-          <w:rFonts w:ascii="Arial" w:hAnsi="Arial" w:cs="Arial"/>
-          <w:sz w:val="14"/>
-          <w:szCs w:val="14"/>
-        </w:rPr>
-        <w:t xml:space="preserve"> instituto </w:t>
-      </w:r>
-      <w:r>
-        <w:rPr>
-          <w:rFonts w:ascii="Arial" w:hAnsi="Arial" w:cs="Arial"/>
-          <w:sz w:val="14"/>
-          <w:szCs w:val="14"/>
-        </w:rPr>
-        <w:t>a partir del día</w:t>
-      </w:r>
-      <w:r>
-        <w:rPr>
-          <w:rFonts w:ascii="Arial" w:hAnsi="Arial" w:cs="Arial"/>
-          <w:sz w:val="14"/>
-          <w:szCs w:val="14"/>
-        </w:rPr>
-        <w:t xml:space="preserve"> </w:t>
-      </w:r>
-      <w:r>
-        <w:rPr>
-          <w:rFonts w:ascii="Arial" w:hAnsi="Arial" w:cs="Arial"/>
-          <w:sz w:val="14"/>
-          <w:szCs w:val="14"/>
-        </w:rPr>
-        <w:t xml:space="preserve">                  </w:t>
-      </w:r>
-    </w:p>
-    <w:p>
-      <w:pPr>
-        <w:tabs>
-          <w:tab w:val="left" w:leader="hyphen" w:pos="709"/>
-          <w:tab w:val="right" w:leader="hyphen" w:pos="9072"/>
-          <w:tab w:val="right" w:leader="hyphen" w:pos="9129"/>
-        </w:tabs>
-        <w:spacing w:line="360" w:lineRule="auto"/>
-        <w:jc w:val="both"/>
-        <w:rPr>
-          <w:rFonts w:ascii="Arial" w:eastAsia="Batang" w:hAnsi="Arial" w:cs="Arial"/>
-          <w:sz w:val="14"/>
-          <w:szCs w:val="14"/>
-        </w:rPr>
-      </w:pPr>
-      <w:r>
-        <w:rPr>
-          <w:rFonts w:ascii="Arial" w:hAnsi="Arial" w:cs="Arial"/>
-          <w:sz w:val="14"/>
-          <w:szCs w:val="14"/>
-        </w:rPr>
-        <w:t xml:space="preserve">           </w:t>
+          <w:rFonts w:ascii="Arial" w:hAnsi="Arial" w:cs="Arial"/>
+          <w:sz w:val="14"/>
+          <w:szCs w:val="14"/>
+        </w:rPr>
+        <w:t>{{ fecha_liquidacion }}</w:t>
       </w:r>
       <w:r>
         <w:rPr>
@@ -3308,61 +3305,16 @@
           <w:sz w:val="14"/>
           <w:szCs w:val="14"/>
         </w:rPr>
-        <w:t>“</w:t>
-      </w:r>
-      <w:r>
-        <w:rPr>
-          <w:rFonts w:ascii="Arial" w:hAnsi="Arial" w:cs="Arial"/>
-          <w:bCs/>
-          <w:sz w:val="14"/>
-          <w:szCs w:val="14"/>
-        </w:rPr>
-        <w:t xml:space="preserve">  </w:t>
-      </w:r>
-      <w:r>
-        <w:rPr>
-          <w:rFonts w:ascii="Arial" w:hAnsi="Arial" w:cs="Arial"/>
-          <w:bCs/>
-          <w:sz w:val="14"/>
-          <w:szCs w:val="14"/>
-        </w:rPr>
-        <w:t xml:space="preserve">          ”</w:t>
-      </w:r>
-      <w:r>
-        <w:rPr>
-          <w:rFonts w:ascii="Arial" w:hAnsi="Arial" w:cs="Arial"/>
-          <w:bCs/>
-          <w:sz w:val="14"/>
-          <w:szCs w:val="14"/>
-        </w:rPr>
-        <w:t xml:space="preserve"> </w:t>
-      </w:r>
-      <w:r>
-        <w:rPr>
-          <w:rFonts w:ascii="Arial" w:hAnsi="Arial" w:cs="Arial"/>
-          <w:bCs/>
-          <w:sz w:val="14"/>
-          <w:szCs w:val="14"/>
-        </w:rPr>
-        <w:t>(</w:t>
-      </w:r>
-      <w:r>
-        <w:rPr>
-          <w:rFonts w:ascii="Arial" w:hAnsi="Arial" w:cs="Arial"/>
-          <w:bCs/>
-          <w:sz w:val="14"/>
-          <w:szCs w:val="14"/>
-        </w:rPr>
-        <w:t xml:space="preserve">       </w:t>
-      </w:r>
-      <w:r>
-        <w:rPr>
-          <w:rFonts w:ascii="Arial" w:hAnsi="Arial" w:cs="Arial"/>
-          <w:bCs/>
-          <w:sz w:val="14"/>
-          <w:szCs w:val="14"/>
-        </w:rPr>
-        <w:t>),</w:t>
+        <w:t>{{ numero_credito }}</w:t>
+      </w:r>
+      <w:r>
+        <w:rPr>
+          <w:rFonts w:ascii="Arial" w:hAnsi="Arial" w:cs="Arial"/>
+          <w:bCs/>
+          <w:sz w:val="14"/>
+          <w:szCs w:val="14"/>
+        </w:rPr>
+        <w:t>,</w:t>
       </w:r>
       <w:r>
         <w:rPr>
@@ -3625,16 +3577,37 @@
           <w:sz w:val="14"/>
           <w:szCs w:val="14"/>
         </w:rPr>
-        <w:t>-------- SEGUNDA</w:t>
-      </w:r>
-      <w:r>
-        <w:rPr>
-          <w:rFonts w:ascii="Arial" w:hAnsi="Arial" w:cs="Arial"/>
-          <w:bCs/>
-          <w:sz w:val="14"/>
-          <w:szCs w:val="14"/>
-        </w:rPr>
-        <w:t>.- En consecuencia, de lo anterior el</w:t>
+        <w:t xml:space="preserve">-------- </w:t>
+      </w:r>
+      <w:proofErr w:type="gramStart"/>
+      <w:r>
+        <w:rPr>
+          <w:rFonts w:ascii="Arial" w:hAnsi="Arial" w:cs="Arial"/>
+          <w:b/>
+          <w:bCs/>
+          <w:sz w:val="14"/>
+          <w:szCs w:val="14"/>
+        </w:rPr>
+        <w:t>SEGUNDA</w:t>
+      </w:r>
+      <w:r>
+        <w:rPr>
+          <w:rFonts w:ascii="Arial" w:hAnsi="Arial" w:cs="Arial"/>
+          <w:bCs/>
+          <w:sz w:val="14"/>
+          <w:szCs w:val="14"/>
+        </w:rPr>
+        <w:t>.-</w:t>
+      </w:r>
+      <w:proofErr w:type="gramEnd"/>
+      <w:r>
+        <w:rPr>
+          <w:rFonts w:ascii="Arial" w:hAnsi="Arial" w:cs="Arial"/>
+          <w:bCs/>
+          <w:sz w:val="14"/>
+          <w:szCs w:val="14"/>
+        </w:rPr>
+        <w:t xml:space="preserve"> En consecuencia, de lo anterior el</w:t>
       </w:r>
       <w:r>
         <w:rPr>
@@ -3719,15 +3692,27 @@
         </w:rPr>
         <w:t xml:space="preserve">-------- </w:t>
       </w:r>
-      <w:r>
-        <w:rPr>
-          <w:rFonts w:ascii="Arial" w:hAnsi="Arial" w:cs="Arial"/>
-          <w:b/>
-          <w:bCs/>
-          <w:sz w:val="14"/>
-          <w:szCs w:val="14"/>
-        </w:rPr>
-        <w:t xml:space="preserve">TERCERA.- </w:t>
+      <w:proofErr w:type="gramStart"/>
+      <w:r>
+        <w:rPr>
+          <w:rFonts w:ascii="Arial" w:hAnsi="Arial" w:cs="Arial"/>
+          <w:b/>
+          <w:bCs/>
+          <w:sz w:val="14"/>
+          <w:szCs w:val="14"/>
+        </w:rPr>
+        <w:t>TERCERA.-</w:t>
+      </w:r>
+      <w:proofErr w:type="gramEnd"/>
+      <w:r>
+        <w:rPr>
+          <w:rFonts w:ascii="Arial" w:hAnsi="Arial" w:cs="Arial"/>
+          <w:b/>
+          <w:bCs/>
+          <w:sz w:val="14"/>
+          <w:szCs w:val="14"/>
+        </w:rPr>
+        <w:t xml:space="preserve"> </w:t>
       </w:r>
       <w:r>
         <w:rPr>
@@ -3820,7 +3805,29 @@
           <w:sz w:val="14"/>
           <w:szCs w:val="14"/>
         </w:rPr>
-        <w:t xml:space="preserve">-------- CUARTA.- </w:t>
+        <w:t xml:space="preserve">-------- </w:t>
+      </w:r>
+      <w:proofErr w:type="gramStart"/>
+      <w:r>
+        <w:rPr>
+          <w:rFonts w:ascii="Arial" w:hAnsi="Arial" w:cs="Arial"/>
+          <w:b/>
+          <w:bCs/>
+          <w:sz w:val="14"/>
+          <w:szCs w:val="14"/>
+        </w:rPr>
+        <w:t>CUARTA.-</w:t>
+      </w:r>
+      <w:proofErr w:type="gramEnd"/>
+      <w:r>
+        <w:rPr>
+          <w:rFonts w:ascii="Arial" w:hAnsi="Arial" w:cs="Arial"/>
+          <w:b/>
+          <w:bCs/>
+          <w:sz w:val="14"/>
+          <w:szCs w:val="14"/>
+        </w:rPr>
+        <w:t xml:space="preserve"> </w:t>
       </w:r>
       <w:r>
         <w:rPr>
@@ -4614,6 +4621,7 @@
         </w:rPr>
         <w:t xml:space="preserve">-------- </w:t>
       </w:r>
+      <w:proofErr w:type="gramStart"/>
       <w:r>
         <w:rPr>
           <w:rFonts w:ascii="Arial" w:eastAsia="MS Mincho" w:hAnsi="Arial" w:cs="Arial"/>
@@ -4621,7 +4629,17 @@
           <w:szCs w:val="14"/>
           <w:lang w:val="es-MX"/>
         </w:rPr>
-        <w:t xml:space="preserve">VI.- Que leí este instrumento a la compareciente, a quien le expliqué su valor, fuerza y las consecuencias legales de su contenido, manifestando su conformidad con el mismo, por lo que lo otorga, ratifica y </w:t>
+        <w:t>VI.-</w:t>
+      </w:r>
+      <w:proofErr w:type="gramEnd"/>
+      <w:r>
+        <w:rPr>
+          <w:rFonts w:ascii="Arial" w:eastAsia="MS Mincho" w:hAnsi="Arial" w:cs="Arial"/>
+          <w:sz w:val="14"/>
+          <w:szCs w:val="14"/>
+          <w:lang w:val="es-MX"/>
+        </w:rPr>
+        <w:t xml:space="preserve"> Que leí este instrumento a la compareciente, a quien le expliqué su valor, fuerza y las consecuencias legales de su contenido, manifestando su conformidad con el mismo, por lo que lo otorga, ratifica y </w:t>
       </w:r>
       <w:r>
         <w:rPr>
@@ -5282,15 +5300,51 @@
           <w:sz w:val="14"/>
           <w:szCs w:val="14"/>
         </w:rPr>
-        <w:t>BENITA HERNÁNDEZ CERÓN</w:t>
-      </w:r>
-      <w:r>
-        <w:rPr>
-          <w:rFonts w:ascii="Arial" w:hAnsi="Arial" w:cs="Arial"/>
-          <w:sz w:val="14"/>
-          <w:szCs w:val="14"/>
-        </w:rPr>
-        <w:t xml:space="preserve">.- FIRMA.- </w:t>
+        <w:t xml:space="preserve">BENITA HERNÁNDEZ </w:t>
+      </w:r>
+      <w:proofErr w:type="gramStart"/>
+      <w:r>
+        <w:rPr>
+          <w:rFonts w:ascii="Arial" w:hAnsi="Arial" w:cs="Arial"/>
+          <w:sz w:val="14"/>
+          <w:szCs w:val="14"/>
+        </w:rPr>
+        <w:t>CERÓN</w:t>
+      </w:r>
+      <w:r>
+        <w:rPr>
+          <w:rFonts w:ascii="Arial" w:hAnsi="Arial" w:cs="Arial"/>
+          <w:sz w:val="14"/>
+          <w:szCs w:val="14"/>
+        </w:rPr>
+        <w:t>.-</w:t>
+      </w:r>
+      <w:proofErr w:type="gramEnd"/>
+      <w:r>
+        <w:rPr>
+          <w:rFonts w:ascii="Arial" w:hAnsi="Arial" w:cs="Arial"/>
+          <w:sz w:val="14"/>
+          <w:szCs w:val="14"/>
+        </w:rPr>
+        <w:t xml:space="preserve"> </w:t>
+      </w:r>
+      <w:proofErr w:type="gramStart"/>
+      <w:r>
+        <w:rPr>
+          <w:rFonts w:ascii="Arial" w:hAnsi="Arial" w:cs="Arial"/>
+          <w:sz w:val="14"/>
+          <w:szCs w:val="14"/>
+        </w:rPr>
+        <w:t>FIRMA.-</w:t>
+      </w:r>
+      <w:proofErr w:type="gramEnd"/>
+      <w:r>
+        <w:rPr>
+          <w:rFonts w:ascii="Arial" w:hAnsi="Arial" w:cs="Arial"/>
+          <w:sz w:val="14"/>
+          <w:szCs w:val="14"/>
+        </w:rPr>
+        <w:t xml:space="preserve"> </w:t>
       </w:r>
       <w:r>
         <w:rPr>
@@ -5307,7 +5361,47 @@
           <w:szCs w:val="14"/>
           <w:lang w:val="es-ES" w:eastAsia="es-MX"/>
         </w:rPr>
-        <w:t>JUAN CARLOS ORTEGA REYES.- FIRMA.- EL SELLO DE AUTORIZAR.</w:t>
+        <w:t xml:space="preserve">JUAN CARLOS ORTEGA </w:t>
+      </w:r>
+      <w:proofErr w:type="gramStart"/>
+      <w:r>
+        <w:rPr>
+          <w:rFonts w:ascii="Arial" w:hAnsi="Arial" w:cs="Arial"/>
+          <w:sz w:val="14"/>
+          <w:szCs w:val="14"/>
+          <w:lang w:val="es-ES" w:eastAsia="es-MX"/>
+        </w:rPr>
+        <w:t>REYES.-</w:t>
+      </w:r>
+      <w:proofErr w:type="gramEnd"/>
+      <w:r>
+        <w:rPr>
+          <w:rFonts w:ascii="Arial" w:hAnsi="Arial" w:cs="Arial"/>
+          <w:sz w:val="14"/>
+          <w:szCs w:val="14"/>
+          <w:lang w:val="es-ES" w:eastAsia="es-MX"/>
+        </w:rPr>
+        <w:t xml:space="preserve"> </w:t>
+      </w:r>
+      <w:proofErr w:type="gramStart"/>
+      <w:r>
+        <w:rPr>
+          <w:rFonts w:ascii="Arial" w:hAnsi="Arial" w:cs="Arial"/>
+          <w:sz w:val="14"/>
+          <w:szCs w:val="14"/>
+          <w:lang w:val="es-ES" w:eastAsia="es-MX"/>
+        </w:rPr>
+        <w:t>FIRMA.-</w:t>
+      </w:r>
+      <w:proofErr w:type="gramEnd"/>
+      <w:r>
+        <w:rPr>
+          <w:rFonts w:ascii="Arial" w:hAnsi="Arial" w:cs="Arial"/>
+          <w:sz w:val="14"/>
+          <w:szCs w:val="14"/>
+          <w:lang w:val="es-ES" w:eastAsia="es-MX"/>
+        </w:rPr>
+        <w:t xml:space="preserve"> EL SELLO DE AUTORIZAR.</w:t>
       </w:r>
       <w:r>
         <w:rPr>
@@ -5428,6 +5522,7 @@
         </w:rPr>
         <w:t xml:space="preserve"> </w:t>
       </w:r>
+      <w:proofErr w:type="gramStart"/>
       <w:r>
         <w:rPr>
           <w:rFonts w:ascii="Arial" w:hAnsi="Arial" w:cs="Arial"/>
@@ -5437,7 +5532,53 @@
           <w:szCs w:val="14"/>
           <w:u w:val="single"/>
         </w:rPr>
-        <w:t>***</w:t>
+        <w:t>{{ nombre</w:t>
+      </w:r>
+      <w:proofErr w:type="gramEnd"/>
+      <w:r>
+        <w:rPr>
+          <w:rFonts w:ascii="Arial" w:hAnsi="Arial" w:cs="Arial"/>
+          <w:b/>
+          <w:bCs/>
+          <w:sz w:val="14"/>
+          <w:szCs w:val="14"/>
+          <w:u w:val="single"/>
+        </w:rPr>
+        <w:t>_</w:t>
+      </w:r>
+      <w:proofErr w:type="gramStart"/>
+      <w:r>
+        <w:rPr>
+          <w:rFonts w:ascii="Arial" w:hAnsi="Arial" w:cs="Arial"/>
+          <w:b/>
+          <w:bCs/>
+          <w:sz w:val="14"/>
+          <w:szCs w:val="14"/>
+          <w:u w:val="single"/>
+        </w:rPr>
+        <w:t>acreditado }</w:t>
+      </w:r>
+      <w:proofErr w:type="gramEnd"/>
+      <w:r>
+        <w:rPr>
+          <w:rFonts w:ascii="Arial" w:hAnsi="Arial" w:cs="Arial"/>
+          <w:b/>
+          <w:bCs/>
+          <w:sz w:val="14"/>
+          <w:szCs w:val="14"/>
+          <w:u w:val="single"/>
+        </w:rPr>
+        <w:t>}</w:t>
+      </w:r>
+      <w:r>
+        <w:rPr>
+          <w:rFonts w:ascii="Arial" w:hAnsi="Arial" w:cs="Arial"/>
+          <w:b/>
+          <w:bCs/>
+          <w:sz w:val="14"/>
+          <w:szCs w:val="14"/>
+        </w:rPr>
+        <w:t xml:space="preserve"> </w:t>
       </w:r>
       <w:r>
         <w:rPr>
@@ -5539,6 +5680,7 @@
         </w:rPr>
         <w:t xml:space="preserve">DOS MIL </w:t>
       </w:r>
+      <w:proofErr w:type="gramStart"/>
       <w:r>
         <w:rPr>
           <w:rFonts w:ascii="Arial" w:hAnsi="Arial" w:cs="Arial"/>
@@ -5555,7 +5697,17 @@
           <w:szCs w:val="14"/>
           <w:lang w:val="es-ES"/>
         </w:rPr>
-        <w:t>.- DOY FE.</w:t>
+        <w:t>.-</w:t>
+      </w:r>
+      <w:proofErr w:type="gramEnd"/>
+      <w:r>
+        <w:rPr>
+          <w:rFonts w:ascii="Arial" w:hAnsi="Arial" w:cs="Arial"/>
+          <w:sz w:val="14"/>
+          <w:szCs w:val="14"/>
+          <w:lang w:val="es-ES"/>
+        </w:rPr>
+        <w:t xml:space="preserve"> DOY FE.</w:t>
       </w:r>
       <w:r>
         <w:rPr>
@@ -7512,8 +7664,52 @@
     <w:lsdException w:name="Subtitle" w:qFormat="1"/>
     <w:lsdException w:name="Strong" w:qFormat="1"/>
     <w:lsdException w:name="Emphasis" w:qFormat="1"/>
+    <w:lsdException w:name="Normal Table" w:semiHidden="1" w:unhideWhenUsed="1"/>
     <w:lsdException w:name="No List" w:uiPriority="99"/>
+    <w:lsdException w:name="Table Simple 1" w:semiHidden="1" w:unhideWhenUsed="1"/>
+    <w:lsdException w:name="Table Simple 2" w:semiHidden="1" w:unhideWhenUsed="1"/>
+    <w:lsdException w:name="Table Simple 3" w:semiHidden="1" w:unhideWhenUsed="1"/>
+    <w:lsdException w:name="Table Classic 1" w:semiHidden="1" w:unhideWhenUsed="1"/>
+    <w:lsdException w:name="Table Classic 2" w:semiHidden="1" w:unhideWhenUsed="1"/>
+    <w:lsdException w:name="Table Classic 3" w:semiHidden="1" w:unhideWhenUsed="1"/>
+    <w:lsdException w:name="Table Classic 4" w:semiHidden="1" w:unhideWhenUsed="1"/>
+    <w:lsdException w:name="Table Colorful 1" w:semiHidden="1" w:unhideWhenUsed="1"/>
+    <w:lsdException w:name="Table Colorful 2" w:semiHidden="1" w:unhideWhenUsed="1"/>
+    <w:lsdException w:name="Table Colorful 3" w:semiHidden="1" w:unhideWhenUsed="1"/>
+    <w:lsdException w:name="Table Columns 1" w:semiHidden="1" w:unhideWhenUsed="1"/>
+    <w:lsdException w:name="Table Columns 2" w:semiHidden="1" w:unhideWhenUsed="1"/>
+    <w:lsdException w:name="Table Columns 3" w:semiHidden="1" w:unhideWhenUsed="1"/>
+    <w:lsdException w:name="Table Columns 4" w:semiHidden="1" w:unhideWhenUsed="1"/>
+    <w:lsdException w:name="Table Columns 5" w:semiHidden="1" w:unhideWhenUsed="1"/>
+    <w:lsdException w:name="Table Grid 1" w:semiHidden="1" w:unhideWhenUsed="1"/>
+    <w:lsdException w:name="Table Grid 2" w:semiHidden="1" w:unhideWhenUsed="1"/>
+    <w:lsdException w:name="Table Grid 3" w:semiHidden="1" w:unhideWhenUsed="1"/>
+    <w:lsdException w:name="Table Grid 4" w:semiHidden="1" w:unhideWhenUsed="1"/>
+    <w:lsdException w:name="Table Grid 5" w:semiHidden="1" w:unhideWhenUsed="1"/>
+    <w:lsdException w:name="Table Grid 6" w:semiHidden="1" w:unhideWhenUsed="1"/>
+    <w:lsdException w:name="Table Grid 7" w:semiHidden="1" w:unhideWhenUsed="1"/>
+    <w:lsdException w:name="Table Grid 8" w:semiHidden="1" w:unhideWhenUsed="1"/>
+    <w:lsdException w:name="Table List 1" w:semiHidden="1" w:unhideWhenUsed="1"/>
+    <w:lsdException w:name="Table List 2" w:semiHidden="1" w:unhideWhenUsed="1"/>
+    <w:lsdException w:name="Table List 3" w:semiHidden="1" w:unhideWhenUsed="1"/>
+    <w:lsdException w:name="Table List 4" w:semiHidden="1" w:unhideWhenUsed="1"/>
+    <w:lsdException w:name="Table List 5" w:semiHidden="1" w:unhideWhenUsed="1"/>
+    <w:lsdException w:name="Table List 6" w:semiHidden="1" w:unhideWhenUsed="1"/>
+    <w:lsdException w:name="Table List 7" w:semiHidden="1" w:unhideWhenUsed="1"/>
+    <w:lsdException w:name="Table List 8" w:semiHidden="1" w:unhideWhenUsed="1"/>
+    <w:lsdException w:name="Table 3D effects 1" w:semiHidden="1" w:unhideWhenUsed="1"/>
+    <w:lsdException w:name="Table 3D effects 2" w:semiHidden="1" w:unhideWhenUsed="1"/>
+    <w:lsdException w:name="Table 3D effects 3" w:semiHidden="1" w:unhideWhenUsed="1"/>
+    <w:lsdException w:name="Table Contemporary" w:semiHidden="1" w:unhideWhenUsed="1"/>
+    <w:lsdException w:name="Table Elegant" w:semiHidden="1" w:unhideWhenUsed="1"/>
+    <w:lsdException w:name="Table Professional" w:semiHidden="1" w:unhideWhenUsed="1"/>
+    <w:lsdException w:name="Table Subtle 1" w:semiHidden="1" w:unhideWhenUsed="1"/>
+    <w:lsdException w:name="Table Subtle 2" w:semiHidden="1" w:unhideWhenUsed="1"/>
+    <w:lsdException w:name="Table Web 1" w:semiHidden="1" w:unhideWhenUsed="1"/>
+    <w:lsdException w:name="Table Web 2" w:semiHidden="1" w:unhideWhenUsed="1"/>
+    <w:lsdException w:name="Table Web 3" w:semiHidden="1" w:unhideWhenUsed="1"/>
     <w:lsdException w:name="Balloon Text" w:uiPriority="99"/>
+    <w:lsdException w:name="Table Theme" w:semiHidden="1" w:unhideWhenUsed="1"/>
     <w:lsdException w:name="Placeholder Text" w:semiHidden="1" w:uiPriority="99"/>
     <w:lsdException w:name="No Spacing" w:uiPriority="1" w:qFormat="1"/>
     <w:lsdException w:name="Light Shading" w:uiPriority="60"/>
@@ -7803,11 +7999,15 @@
   </w:style>
   <w:style w:type="character" w:default="1" w:styleId="Fuentedeprrafopredeter">
     <w:name w:val="Default Paragraph Font"/>
+    <w:uiPriority w:val="1"/>
     <w:semiHidden/>
+    <w:unhideWhenUsed/>
   </w:style>
   <w:style w:type="table" w:default="1" w:styleId="Tablanormal">
     <w:name w:val="Normal Table"/>
+    <w:uiPriority w:val="99"/>
     <w:semiHidden/>
+    <w:unhideWhenUsed/>
     <w:tblPr>
       <w:tblInd w:w="0" w:type="dxa"/>
       <w:tblCellMar>
@@ -7822,6 +8022,7 @@
     <w:name w:val="No List"/>
     <w:uiPriority w:val="99"/>
     <w:semiHidden/>
+    <w:unhideWhenUsed/>
   </w:style>
   <w:style w:type="paragraph" w:styleId="Textoindependiente3">
     <w:name w:val="Body Text 3"/>
@@ -7839,8 +8040,8 @@
       <w:sz w:val="40"/>
     </w:rPr>
   </w:style>
-  <w:style w:type="paragraph" w:customStyle="1" w:styleId="Heading3">
-    <w:name w:val="Heading 3"/>
+  <w:style w:type="paragraph" w:customStyle="1" w:styleId="Ttulo31">
+    <w:name w:val="Título 31"/>
     <w:basedOn w:val="Normal"/>
     <w:rsid w:val="00BE25B6"/>
     <w:pPr>
@@ -7854,8 +8055,8 @@
       <w:sz w:val="24"/>
     </w:rPr>
   </w:style>
-  <w:style w:type="paragraph" w:customStyle="1" w:styleId="Heading4">
-    <w:name w:val="Heading 4"/>
+  <w:style w:type="paragraph" w:customStyle="1" w:styleId="Ttulo41">
+    <w:name w:val="Título 41"/>
     <w:basedOn w:val="Normal"/>
     <w:rsid w:val="00BE25B6"/>
     <w:pPr>
@@ -7885,8 +8086,8 @@
       <w:u w:val="single"/>
     </w:rPr>
   </w:style>
-  <w:style w:type="paragraph" w:customStyle="1" w:styleId="Heading2">
-    <w:name w:val="Heading 2"/>
+  <w:style w:type="paragraph" w:customStyle="1" w:styleId="Ttulo21">
+    <w:name w:val="Título 21"/>
     <w:basedOn w:val="Normal"/>
     <w:rsid w:val="00BE25B6"/>
     <w:pPr>
@@ -7911,8 +8112,8 @@
       <w:spacing w:after="120" w:line="480" w:lineRule="auto"/>
     </w:pPr>
   </w:style>
-  <w:style w:type="paragraph" w:customStyle="1" w:styleId="Heading1">
-    <w:name w:val="Heading 1"/>
+  <w:style w:type="paragraph" w:customStyle="1" w:styleId="Ttulo11">
+    <w:name w:val="Título 11"/>
     <w:basedOn w:val="Normal"/>
     <w:rsid w:val="00BE25B6"/>
     <w:pPr>
@@ -7926,8 +8127,8 @@
       <w:lang w:val="es-MX"/>
     </w:rPr>
   </w:style>
-  <w:style w:type="paragraph" w:customStyle="1" w:styleId="BodyText2">
-    <w:name w:val="Body Text 2"/>
+  <w:style w:type="paragraph" w:customStyle="1" w:styleId="Textoindependiente21">
+    <w:name w:val="Texto independiente 21"/>
     <w:basedOn w:val="Normal"/>
     <w:rsid w:val="00BE25B6"/>
     <w:pPr>
@@ -7943,8 +8144,8 @@
       <w:sz w:val="24"/>
     </w:rPr>
   </w:style>
-  <w:style w:type="paragraph" w:customStyle="1" w:styleId="BodyText3">
-    <w:name w:val="Body Text 3"/>
+  <w:style w:type="paragraph" w:customStyle="1" w:styleId="Textoindependiente31">
+    <w:name w:val="Texto independiente 31"/>
     <w:basedOn w:val="Normal"/>
     <w:rsid w:val="00BE25B6"/>
     <w:pPr>

</xml_diff>

<commit_message>
Recuadros separados para carta y constancia, notario con formato, inmueble sin vacios, carta y VSM con letra
</commit_message>
<xml_diff>
--- a/backend/templates/CDMX_AP_H_CASADO.docx
+++ b/backend/templates/CDMX_AP_H_CASADO.docx
@@ -1548,7 +1548,7 @@
           <w:szCs w:val="14"/>
           <w:lang w:val="es-ES"/>
         </w:rPr>
-        <w:t>otorgado ante la fe del Licenciado</w:t>
+        <w:t xml:space="preserve">otorgado ante la fe </w:t>
       </w:r>
       <w:r>
         <w:rPr>
@@ -1557,7 +1557,7 @@
           <w:szCs w:val="14"/>
           <w:lang w:val="es-ES"/>
         </w:rPr>
-        <w:t xml:space="preserve"> </w:t>
+        <w:t xml:space="preserve"/>
       </w:r>
       <w:r>
         <w:rPr>

</xml_diff>